<commit_message>
feat(dispute): consolidate hydramax dispute manager, audit tube contract, generate legal briefs and David letters, update session summary
</commit_message>
<xml_diff>
--- a/projects/HR/Китайский снабженец/Вводный_инструктаж_и_спринт_Ли_Юйнань_Снабжение.docx
+++ b/projects/HR/Китайский снабженец/Вводный_инструктаж_и_спринт_Ли_Юйнань_Снабжение.docx
@@ -4,47 +4,98 @@
   <w:body>
     <w:p>
       <w:pPr>
+        <w:spacing w:before="0" w:after="240"/>
         <w:jc w:val="center"/>
       </w:pPr>
       <w:r>
         <w:rPr>
-          <w:rFonts w:ascii="Calibri" w:hAnsi="Calibri"/>
           <w:b/>
-          <w:color w:val="182B49"/>
-          <w:sz w:val="36"/>
+          <w:color w:val="003366"/>
+          <w:sz w:val="30"/>
         </w:rPr>
         <w:t>ВВОДНЫЙ ДОКУМЕНТ И РАБОЧИЙ СПРИНТ</w:t>
+        <w:br/>
       </w:r>
-    </w:p>
-    <w:p>
-      <w:pPr>
-        <w:jc w:val="center"/>
-      </w:pPr>
       <w:r>
         <w:rPr>
-          <w:rFonts w:ascii="Calibri" w:hAnsi="Calibri"/>
-          <w:color w:val="646E7D"/>
-          <w:sz w:val="24"/>
+          <w:i/>
+          <w:color w:val="555555"/>
+          <w:sz w:val="21"/>
         </w:rPr>
         <w:t>Организация работы снабжения, стандарты взаимодействия с клиентами и фабриками</w:t>
+        <w:br/>
+        <w:t>中国办事处工业品采购工作准则与冲刺指南（李玉南女士专用）</w:t>
       </w:r>
     </w:p>
     <w:tbl>
       <w:tblPr>
         <w:tblW w:type="auto" w:w="0"/>
         <w:jc w:val="center"/>
-        <w:tblLayout w:type="fixed"/>
         <w:tblLook w:firstColumn="1" w:firstRow="1" w:lastColumn="0" w:lastRow="0" w:noHBand="0" w:noVBand="1" w:val="04A0"/>
       </w:tblPr>
       <w:tblGrid>
-        <w:gridCol w:w="4968"/>
-        <w:gridCol w:w="4968"/>
+        <w:gridCol w:w="5040"/>
+        <w:gridCol w:w="5040"/>
       </w:tblGrid>
       <w:tr>
         <w:tc>
           <w:tcPr>
-            <w:tcW w:type="dxa" w:w="3168"/>
-            <w:shd w:fill="F0F4F8"/>
+            <w:tcW w:type="dxa" w:w="3312"/>
+            <w:shd w:fill="1E3A8A"/>
+            <w:tcMar>
+              <w:top w:w="100" w:type="dxa"/>
+              <w:bottom w:w="100" w:type="dxa"/>
+              <w:left w:w="120" w:type="dxa"/>
+              <w:right w:w="120" w:type="dxa"/>
+            </w:tcMar>
+          </w:tcPr>
+          <w:p>
+            <w:pPr>
+              <w:spacing w:before="0" w:after="0"/>
+              <w:jc w:val="left"/>
+            </w:pPr>
+            <w:r>
+              <w:rPr>
+                <w:b/>
+                <w:color w:val="FFFFFF"/>
+                <w:sz w:val="19"/>
+              </w:rPr>
+              <w:t>Параметр / 属性</w:t>
+            </w:r>
+          </w:p>
+        </w:tc>
+        <w:tc>
+          <w:tcPr>
+            <w:tcW w:type="dxa" w:w="6768"/>
+            <w:shd w:fill="1E3A8A"/>
+            <w:tcMar>
+              <w:top w:w="100" w:type="dxa"/>
+              <w:bottom w:w="100" w:type="dxa"/>
+              <w:left w:w="120" w:type="dxa"/>
+              <w:right w:w="120" w:type="dxa"/>
+            </w:tcMar>
+          </w:tcPr>
+          <w:p>
+            <w:pPr>
+              <w:spacing w:before="0" w:after="0"/>
+              <w:jc w:val="left"/>
+            </w:pPr>
+            <w:r>
+              <w:rPr>
+                <w:b/>
+                <w:color w:val="FFFFFF"/>
+                <w:sz w:val="19"/>
+              </w:rPr>
+              <w:t>Значение / 内容</w:t>
+            </w:r>
+          </w:p>
+        </w:tc>
+      </w:tr>
+      <w:tr>
+        <w:tc>
+          <w:tcPr>
+            <w:tcW w:type="dxa" w:w="3312"/>
+            <w:shd w:fill="FFFFFF"/>
             <w:tcMar>
               <w:top w:w="80" w:type="dxa"/>
               <w:bottom w:w="80" w:type="dxa"/>
@@ -53,11 +104,12 @@
             </w:tcMar>
           </w:tcPr>
           <w:p>
+            <w:pPr>
+              <w:spacing w:before="0" w:after="0" w:line="276" w:lineRule="auto"/>
+            </w:pPr>
             <w:r>
               <w:rPr>
-                <w:b/>
-                <w:color w:val="1E293B"/>
-                <w:sz w:val="20"/>
+                <w:sz w:val="18"/>
               </w:rPr>
               <w:t>Сотрудник / Адресат:</w:t>
             </w:r>
@@ -65,7 +117,32 @@
         </w:tc>
         <w:tc>
           <w:tcPr>
-            <w:tcW w:type="dxa" w:w="6192"/>
+            <w:tcW w:type="dxa" w:w="6768"/>
+            <w:shd w:fill="FFFFFF"/>
+            <w:tcMar>
+              <w:top w:w="80" w:type="dxa"/>
+              <w:bottom w:w="80" w:type="dxa"/>
+              <w:left w:w="120" w:type="dxa"/>
+              <w:right w:w="120" w:type="dxa"/>
+            </w:tcMar>
+          </w:tcPr>
+          <w:p>
+            <w:pPr>
+              <w:spacing w:before="0" w:after="0" w:line="276" w:lineRule="auto"/>
+            </w:pPr>
+            <w:r>
+              <w:rPr>
+                <w:sz w:val="18"/>
+              </w:rPr>
+              <w:t>Ли Юйнань (李玉南 / Ms. An #31)</w:t>
+            </w:r>
+          </w:p>
+        </w:tc>
+      </w:tr>
+      <w:tr>
+        <w:tc>
+          <w:tcPr>
+            <w:tcW w:type="dxa" w:w="3312"/>
             <w:shd w:fill="F8FAFC"/>
             <w:tcMar>
               <w:top w:w="80" w:type="dxa"/>
@@ -75,42 +152,20 @@
             </w:tcMar>
           </w:tcPr>
           <w:p>
+            <w:pPr>
+              <w:spacing w:before="0" w:after="0" w:line="276" w:lineRule="auto"/>
+            </w:pPr>
             <w:r>
               <w:rPr>
-                <w:color w:val="0F172A"/>
-                <w:sz w:val="20"/>
+                <w:sz w:val="18"/>
               </w:rPr>
-              <w:t>Ли Юйнань (李玉南 / Ms. An #31)</w:t>
-            </w:r>
-          </w:p>
-        </w:tc>
-      </w:tr>
-      <w:tr>
-        <w:tc>
-          <w:tcPr>
-            <w:tcW w:type="dxa" w:w="3168"/>
-            <w:shd w:fill="F0F4F8"/>
-            <w:tcMar>
-              <w:top w:w="80" w:type="dxa"/>
-              <w:bottom w:w="80" w:type="dxa"/>
-              <w:left w:w="120" w:type="dxa"/>
-              <w:right w:w="120" w:type="dxa"/>
-            </w:tcMar>
-          </w:tcPr>
-          <w:p>
-            <w:r>
-              <w:rPr>
-                <w:b/>
-                <w:color w:val="1E293B"/>
-                <w:sz w:val="20"/>
-              </w:rPr>
-              <w:t>Направление и статус:</w:t>
+              <w:t>Должность и статус:</w:t>
             </w:r>
           </w:p>
         </w:tc>
         <w:tc>
           <w:tcPr>
-            <w:tcW w:type="dxa" w:w="6192"/>
+            <w:tcW w:type="dxa" w:w="6768"/>
             <w:shd w:fill="F8FAFC"/>
             <w:tcMar>
               <w:top w:w="80" w:type="dxa"/>
@@ -120,18 +175,168 @@
             </w:tcMar>
           </w:tcPr>
           <w:p>
+            <w:pPr>
+              <w:spacing w:before="0" w:after="0" w:line="276" w:lineRule="auto"/>
+            </w:pPr>
             <w:r>
               <w:rPr>
-                <w:color w:val="0F172A"/>
-                <w:sz w:val="20"/>
+                <w:sz w:val="18"/>
               </w:rPr>
               <w:t>Специалист по снабжению и закупкам промышленного оборудования в КНР</w:t>
             </w:r>
           </w:p>
         </w:tc>
       </w:tr>
+      <w:tr>
+        <w:tc>
+          <w:tcPr>
+            <w:tcW w:type="dxa" w:w="3312"/>
+            <w:shd w:fill="FFFFFF"/>
+            <w:tcMar>
+              <w:top w:w="80" w:type="dxa"/>
+              <w:bottom w:w="80" w:type="dxa"/>
+              <w:left w:w="120" w:type="dxa"/>
+              <w:right w:w="120" w:type="dxa"/>
+            </w:tcMar>
+          </w:tcPr>
+          <w:p>
+            <w:pPr>
+              <w:spacing w:before="0" w:after="0" w:line="276" w:lineRule="auto"/>
+            </w:pPr>
+            <w:r>
+              <w:rPr>
+                <w:sz w:val="18"/>
+              </w:rPr>
+              <w:t>Локация и формат:</w:t>
+            </w:r>
+          </w:p>
+        </w:tc>
+        <w:tc>
+          <w:tcPr>
+            <w:tcW w:type="dxa" w:w="6768"/>
+            <w:shd w:fill="FFFFFF"/>
+            <w:tcMar>
+              <w:top w:w="80" w:type="dxa"/>
+              <w:bottom w:w="80" w:type="dxa"/>
+              <w:left w:w="120" w:type="dxa"/>
+              <w:right w:w="120" w:type="dxa"/>
+            </w:tcMar>
+          </w:tcPr>
+          <w:p>
+            <w:pPr>
+              <w:spacing w:before="0" w:after="0" w:line="276" w:lineRule="auto"/>
+            </w:pPr>
+            <w:r>
+              <w:rPr>
+                <w:sz w:val="18"/>
+              </w:rPr>
+              <w:t>КНР, удаленный полный рабочий день</w:t>
+            </w:r>
+          </w:p>
+        </w:tc>
+      </w:tr>
+      <w:tr>
+        <w:tc>
+          <w:tcPr>
+            <w:tcW w:type="dxa" w:w="3312"/>
+            <w:shd w:fill="F8FAFC"/>
+            <w:tcMar>
+              <w:top w:w="80" w:type="dxa"/>
+              <w:bottom w:w="80" w:type="dxa"/>
+              <w:left w:w="120" w:type="dxa"/>
+              <w:right w:w="120" w:type="dxa"/>
+            </w:tcMar>
+          </w:tcPr>
+          <w:p>
+            <w:pPr>
+              <w:spacing w:before="0" w:after="0" w:line="276" w:lineRule="auto"/>
+            </w:pPr>
+            <w:r>
+              <w:rPr>
+                <w:sz w:val="18"/>
+              </w:rPr>
+              <w:t>Внутренние заказчики:</w:t>
+            </w:r>
+          </w:p>
+        </w:tc>
+        <w:tc>
+          <w:tcPr>
+            <w:tcW w:type="dxa" w:w="6768"/>
+            <w:shd w:fill="F8FAFC"/>
+            <w:tcMar>
+              <w:top w:w="80" w:type="dxa"/>
+              <w:bottom w:w="80" w:type="dxa"/>
+              <w:left w:w="120" w:type="dxa"/>
+              <w:right w:w="120" w:type="dxa"/>
+            </w:tcMar>
+          </w:tcPr>
+          <w:p>
+            <w:pPr>
+              <w:spacing w:before="0" w:after="0" w:line="276" w:lineRule="auto"/>
+            </w:pPr>
+            <w:r>
+              <w:rPr>
+                <w:sz w:val="18"/>
+              </w:rPr>
+              <w:t>Александра (Тендеры АСТ ГОЗ), Артём (Коммерческие заказы), Анжелика (Логистика РФ)</w:t>
+            </w:r>
+          </w:p>
+        </w:tc>
+      </w:tr>
+      <w:tr>
+        <w:tc>
+          <w:tcPr>
+            <w:tcW w:type="dxa" w:w="3312"/>
+            <w:shd w:fill="FFFFFF"/>
+            <w:tcMar>
+              <w:top w:w="80" w:type="dxa"/>
+              <w:bottom w:w="80" w:type="dxa"/>
+              <w:left w:w="120" w:type="dxa"/>
+              <w:right w:w="120" w:type="dxa"/>
+            </w:tcMar>
+          </w:tcPr>
+          <w:p>
+            <w:pPr>
+              <w:spacing w:before="0" w:after="0" w:line="276" w:lineRule="auto"/>
+            </w:pPr>
+            <w:r>
+              <w:rPr>
+                <w:sz w:val="18"/>
+              </w:rPr>
+              <w:t>Ключевая цель спринта:</w:t>
+            </w:r>
+          </w:p>
+        </w:tc>
+        <w:tc>
+          <w:tcPr>
+            <w:tcW w:type="dxa" w:w="6768"/>
+            <w:shd w:fill="FFFFFF"/>
+            <w:tcMar>
+              <w:top w:w="80" w:type="dxa"/>
+              <w:bottom w:w="80" w:type="dxa"/>
+              <w:left w:w="120" w:type="dxa"/>
+              <w:right w:w="120" w:type="dxa"/>
+            </w:tcMar>
+          </w:tcPr>
+          <w:p>
+            <w:pPr>
+              <w:spacing w:before="0" w:after="0" w:line="276" w:lineRule="auto"/>
+            </w:pPr>
+            <w:r>
+              <w:rPr>
+                <w:sz w:val="18"/>
+              </w:rPr>
+              <w:t>Освоить Битрикс24 по инструкции, войти в тандем 50/50 с Ван, отрабатывать ВСЕ заявки без задержек</w:t>
+            </w:r>
+          </w:p>
+        </w:tc>
+      </w:tr>
     </w:tbl>
-    <w:p/>
+    <w:p>
+      <w:pPr>
+        <w:spacing w:after="120"/>
+      </w:pPr>
+    </w:p>
     <w:tbl>
       <w:tblPr>
         <w:tblW w:type="auto" w:w="0"/>
@@ -139,276 +344,153 @@
         <w:tblLook w:firstColumn="1" w:firstRow="1" w:lastColumn="0" w:lastRow="0" w:noHBand="0" w:noVBand="1" w:val="04A0"/>
       </w:tblPr>
       <w:tblGrid>
-        <w:gridCol w:w="9936"/>
+        <w:gridCol w:w="10080"/>
       </w:tblGrid>
       <w:tr>
         <w:tc>
           <w:tcPr>
-            <w:tcW w:type="dxa" w:w="9360"/>
-            <w:shd w:fill="F1F5F9"/>
+            <w:tcW w:type="dxa" w:w="10080"/>
+            <w:shd w:fill="F2F5F9"/>
             <w:tcMar>
-              <w:top w:w="100" w:type="dxa"/>
-              <w:bottom w:w="100" w:type="dxa"/>
-              <w:left w:w="140" w:type="dxa"/>
-              <w:right w:w="140" w:type="dxa"/>
+              <w:top w:w="120" w:type="dxa"/>
+              <w:bottom w:w="120" w:type="dxa"/>
+              <w:left w:w="180" w:type="dxa"/>
+              <w:right w:w="180" w:type="dxa"/>
             </w:tcMar>
           </w:tcPr>
           <w:p>
             <w:pPr>
-              <w:spacing w:after="40" w:line="276" w:lineRule="auto"/>
+              <w:spacing w:before="0" w:after="0" w:line="276" w:lineRule="auto"/>
             </w:pPr>
             <w:r>
               <w:rPr>
                 <w:b/>
-                <w:color w:val="0F172A"/>
-                <w:sz w:val="21"/>
+                <w:color w:val="003366"/>
+                <w:sz w:val="20"/>
               </w:rPr>
-              <w:t>📌 Принцип эффективности</w:t>
-              <w:br/>
+              <w:t xml:space="preserve">ПРИНЦИП ЭФФЕКТИВНОСТИ И ДОВЕРИЯ: </w:t>
             </w:r>
             <w:r>
               <w:rPr>
-                <w:color w:val="334155"/>
+                <w:i/>
                 <w:sz w:val="19"/>
               </w:rPr>
-              <w:t>Главный ориентир в работе снабженца — скорость, точность параметров и ответственность за результат. Мы не учим вас жить и вести переговоры с заводами — с вашим пониманием китайского бизнеса вам на месте виднее. От вас требуются: быстрая реакция на заявки, понимание приоритетов, соблюдение дисциплины и работа на общий результат.</w:t>
+              <w:t>Уважаемая госпожа Ли Юйнань! Поздравляем вас со вступлением в команду снабжения компании «Лун-Ван». Главный ориентир в работе снабженца — скорость, глубина технической проверки и персональная ответственность за результат. Мы не учим вас жить и вести диалог с заводами — с вашим пониманием китайского бизнеса вам на месте виднее. От вас требуются: быстрая реакция на заявки, самостоятельность в технических деталях, соблюдение дисциплины и работа на общий результат.</w:t>
             </w:r>
           </w:p>
         </w:tc>
       </w:tr>
     </w:tbl>
-    <w:p/>
+    <w:p>
+      <w:pPr>
+        <w:spacing w:after="80"/>
+      </w:pPr>
+    </w:p>
     <w:p>
       <w:pPr>
         <w:keepNext/>
-        <w:spacing w:before="280" w:after="120"/>
+        <w:spacing w:before="280" w:after="80"/>
       </w:pPr>
       <w:r>
         <w:rPr>
-          <w:rFonts w:ascii="Calibri" w:hAnsi="Calibri"/>
           <w:b/>
-          <w:color w:val="0F2C59"/>
-          <w:sz w:val="28"/>
+          <w:color w:val="003366"/>
+          <w:sz w:val="25"/>
         </w:rPr>
         <w:t>1. Цель и ключевая задача: Работа в тандеме 50/50</w:t>
       </w:r>
     </w:p>
     <w:p>
       <w:pPr>
-        <w:spacing w:after="80" w:line="276" w:lineRule="auto"/>
+        <w:spacing w:before="0" w:after="80" w:line="276" w:lineRule="auto"/>
       </w:pPr>
       <w:r>
         <w:rPr>
-          <w:i w:val="0"/>
           <w:sz w:val="20"/>
         </w:rPr>
-        <w:t>Уважаемая госпожа Ли Юйнань! Поздравляем вас со вступлением в команду снабжения компании «Лун-Ван». Вы наняты на полный рабочий день в удаленном формате с окладом 4 000 юаней на испытательный срок и участием в премиальном фонде по итогам закрытых заказов и возврата экспортного НДС.</w:t>
+        <w:t>Компания масштабирует продажи промышленного оборудования в России: сейчас идет непрерывный поток государственных тендеров (АСТ ГОЗ) и прямых коммерческих заказов от ведущих заводов РФ. Снабжение получает большой объем задач.</w:t>
       </w:r>
     </w:p>
     <w:p>
       <w:pPr>
-        <w:spacing w:after="80" w:line="276" w:lineRule="auto"/>
+        <w:pStyle w:val="ListBullet"/>
+        <w:spacing w:before="20" w:after="60" w:line="276" w:lineRule="auto"/>
       </w:pPr>
       <w:r>
         <w:rPr>
-          <w:i w:val="0"/>
+          <w:b/>
           <w:sz w:val="20"/>
         </w:rPr>
-        <w:t>Сейчас компания кратно масштабирует продажи промышленного оборудования в России: идет огромный поток государственных тендеров (АСТ ГОЗ) и прямых коммерческих заказов от заводов РФ. Снабжение будет завалено заявками. Вы выходите в полноценный равноправный тандем с госпожой Ван (Miss Wang): входящий поток задач распределяется между вами поровну (50% на 50%).</w:t>
+        <w:t xml:space="preserve">Равноправный тандем: </w:t>
+      </w:r>
+      <w:r>
+        <w:rPr>
+          <w:sz w:val="20"/>
+        </w:rPr>
+        <w:t>Вы выходите в полноценный равноправный тандем со специалистом по закупкам госпожой Ван (Miss Wang). Весь входящий поток задач распределяется между вами поровну (50% на 50%).</w:t>
+      </w:r>
+    </w:p>
+    <w:p>
+      <w:pPr>
+        <w:pStyle w:val="ListBullet"/>
+        <w:spacing w:before="20" w:after="60" w:line="276" w:lineRule="auto"/>
+      </w:pPr>
+      <w:r>
+        <w:rPr>
+          <w:b/>
+          <w:sz w:val="20"/>
+        </w:rPr>
+        <w:t xml:space="preserve">Взаимовыручка: </w:t>
+      </w:r>
+      <w:r>
+        <w:rPr>
+          <w:sz w:val="20"/>
+        </w:rPr>
+        <w:t>Снабженец Ван и вы — два крыла одного самолета. Вы не конкурируете, а подставляете друг другу плечо: при высокой загрузке подхватываете задачи напарницы и работаете синхронно.</w:t>
+      </w:r>
+    </w:p>
+    <w:p>
+      <w:pPr>
+        <w:pStyle w:val="ListBullet"/>
+        <w:spacing w:before="20" w:after="60" w:line="276" w:lineRule="auto"/>
+      </w:pPr>
+      <w:r>
+        <w:rPr>
+          <w:b/>
+          <w:sz w:val="20"/>
+        </w:rPr>
+        <w:t xml:space="preserve">Единая система: </w:t>
+      </w:r>
+      <w:r>
+        <w:rPr>
+          <w:sz w:val="20"/>
+        </w:rPr>
+        <w:t>Вся операционная работа, получение ТЗ и отчетность ведутся в Битрикс24 в соответствии со специальной пошаговой инструкцией.</w:t>
       </w:r>
     </w:p>
     <w:p>
       <w:pPr>
         <w:keepNext/>
-        <w:spacing w:before="280" w:after="120"/>
+        <w:spacing w:before="280" w:after="80"/>
       </w:pPr>
       <w:r>
         <w:rPr>
-          <w:rFonts w:ascii="Calibri" w:hAnsi="Calibri"/>
           <w:b/>
-          <w:color w:val="0F2C59"/>
-          <w:sz w:val="28"/>
+          <w:color w:val="003366"/>
+          <w:sz w:val="25"/>
         </w:rPr>
         <w:t>2. Наша команда и принцип «Мы = Клиент»</w:t>
       </w:r>
     </w:p>
     <w:p>
       <w:pPr>
-        <w:spacing w:after="80" w:line="276" w:lineRule="auto"/>
+        <w:spacing w:before="0" w:after="80" w:line="276" w:lineRule="auto"/>
       </w:pPr>
-      <w:r>
-        <w:rPr>
-          <w:i w:val="0"/>
-          <w:sz w:val="20"/>
-        </w:rPr>
-        <w:t>Для вас Александра, Артём и Анжелика выступают ВНУТРЕННИМИ КЛИЕНТАМИ. Мы транслируем требования конечного российского покупателя. Ваш доход напрямую зависит от того, сколько наших заказов вы качественно и вовремя отработаете.</w:t>
-      </w:r>
-    </w:p>
-    <w:p>
-      <w:pPr>
-        <w:pStyle w:val="ListBullet"/>
-        <w:spacing w:after="60" w:line="276" w:lineRule="auto"/>
-      </w:pPr>
-      <w:r>
-        <w:rPr>
-          <w:b/>
-          <w:sz w:val="20"/>
-        </w:rPr>
-        <w:t>Александра (Тендерный отдел / Внутренний Клиент):</w:t>
-      </w:r>
       <w:r>
         <w:rPr>
           <w:sz w:val="20"/>
         </w:rPr>
-        <w:t xml:space="preserve"> Ведущий специалист по тендерам (АСТ ГОЗ). Главный внутренний клиент по торгам. Ставит задачи на расчет сложных лотов. Ждет от вас максимальной скорости и четкого соблюдения ТЗ.</w:t>
-      </w:r>
-    </w:p>
-    <w:p>
-      <w:pPr>
-        <w:pStyle w:val="ListBullet"/>
-        <w:spacing w:after="60" w:line="276" w:lineRule="auto"/>
-      </w:pPr>
-      <w:r>
-        <w:rPr>
-          <w:b/>
-          <w:sz w:val="20"/>
-        </w:rPr>
-        <w:t>Артём (Я / Руководитель компании):</w:t>
-      </w:r>
-      <w:r>
-        <w:rPr>
-          <w:sz w:val="20"/>
-        </w:rPr>
-        <w:t xml:space="preserve"> Руководитель компании. Ставит задачи по коммерческим заказчикам оборудования в РФ, контролирует маржинальность и сроки. Не терпит замалчивания проблем и сорванных дедлайнов.</w:t>
-      </w:r>
-    </w:p>
-    <w:p>
-      <w:pPr>
-        <w:pStyle w:val="ListBullet"/>
-        <w:spacing w:after="60" w:line="276" w:lineRule="auto"/>
-      </w:pPr>
-      <w:r>
-        <w:rPr>
-          <w:b/>
-          <w:sz w:val="20"/>
-        </w:rPr>
-        <w:t>Анжелика (Логистика в РФ / B2B-продажи):</w:t>
-      </w:r>
-      <w:r>
-        <w:rPr>
-          <w:sz w:val="20"/>
-        </w:rPr>
-        <w:t xml:space="preserve"> Главный логист в РФ и менеджер коммерческих B2B-продаж. Принимает информацию о готовых грузах, организует растаможку и местную доставку клиентам в РФ.</w:t>
-      </w:r>
-    </w:p>
-    <w:p>
-      <w:pPr>
-        <w:pStyle w:val="ListBullet"/>
-        <w:spacing w:after="60" w:line="276" w:lineRule="auto"/>
-      </w:pPr>
-      <w:r>
-        <w:rPr>
-          <w:b/>
-          <w:sz w:val="20"/>
-        </w:rPr>
-        <w:t>Азат (Снабжение / Старший куратор):</w:t>
-      </w:r>
-      <w:r>
-        <w:rPr>
-          <w:sz w:val="20"/>
-        </w:rPr>
-        <w:t xml:space="preserve"> Ведущий специалист по снабжению и старший наставник. Ваш технический щит: помогает при сложных чертежах, нестандартных требованиях ГОСТов или спорах с заводами. Проверяет пульс задач в Битрикс24 дважды в день.</w:t>
-      </w:r>
-    </w:p>
-    <w:p>
-      <w:pPr>
-        <w:pStyle w:val="ListBullet"/>
-        <w:spacing w:after="60" w:line="276" w:lineRule="auto"/>
-      </w:pPr>
-      <w:r>
-        <w:rPr>
-          <w:b/>
-          <w:sz w:val="20"/>
-        </w:rPr>
-        <w:t>Цянь Ин (Шеф-логист в КНР):</w:t>
-      </w:r>
-      <w:r>
-        <w:rPr>
-          <w:sz w:val="20"/>
-        </w:rPr>
-        <w:t xml:space="preserve"> Руководитель международной логистики. Обеспечивает прием товаров на партнерские склады консолидации и организует доставку в Россию.</w:t>
-      </w:r>
-    </w:p>
-    <w:p>
-      <w:pPr>
-        <w:pStyle w:val="ListBullet"/>
-        <w:spacing w:after="60" w:line="276" w:lineRule="auto"/>
-      </w:pPr>
-      <w:r>
-        <w:rPr>
-          <w:b/>
-          <w:sz w:val="20"/>
-        </w:rPr>
-        <w:t>Ирина (Главный бухгалтер):</w:t>
-      </w:r>
-      <w:r>
-        <w:rPr>
-          <w:sz w:val="20"/>
-        </w:rPr>
-        <w:t xml:space="preserve"> Главный бухгалтер. Контролирует счета, реквизиты заводов и возврат экспортного НДС (13% 专票).</w:t>
-      </w:r>
-    </w:p>
-    <w:p>
-      <w:pPr>
-        <w:pStyle w:val="ListBullet"/>
-        <w:spacing w:after="60" w:line="276" w:lineRule="auto"/>
-      </w:pPr>
-      <w:r>
-        <w:rPr>
-          <w:b/>
-          <w:sz w:val="20"/>
-        </w:rPr>
-        <w:t>Ван (Miss Wang / user/30, снабжение):</w:t>
-      </w:r>
-      <w:r>
-        <w:rPr>
-          <w:sz w:val="20"/>
-        </w:rPr>
-        <w:t xml:space="preserve"> Ваша напарница по закупкам. Делите объем 50/50, подставляете плечо при перегрузках.</w:t>
-      </w:r>
-    </w:p>
-    <w:p>
-      <w:pPr>
-        <w:pStyle w:val="ListBullet"/>
-        <w:spacing w:after="60" w:line="276" w:lineRule="auto"/>
-      </w:pPr>
-      <w:r>
-        <w:rPr>
-          <w:b/>
-          <w:sz w:val="20"/>
-        </w:rPr>
-        <w:t>Лиень (user/44, логист / ассистент):</w:t>
-      </w:r>
-      <w:r>
-        <w:rPr>
-          <w:sz w:val="20"/>
-        </w:rPr>
-        <w:t xml:space="preserve"> Действующий логист и оперативный помощник снабжения. Лиень помогает в прозвоне фабрик по Китаю, контроле соблюдения сроков производства (催交货期) и оперативных поручениях.</w:t>
-      </w:r>
-    </w:p>
-    <w:p>
-      <w:pPr>
-        <w:keepNext/>
-        <w:spacing w:before="280" w:after="120"/>
-      </w:pPr>
-      <w:r>
-        <w:rPr>
-          <w:rFonts w:ascii="Calibri" w:hAnsi="Calibri"/>
-          <w:b/>
-          <w:color w:val="0F2C59"/>
-          <w:sz w:val="28"/>
-        </w:rPr>
-        <w:t>3. Принципиальный кодекс руководителя по фабрикам и поставщикам</w:t>
+        <w:t>Для вас менеджеры в России выступают ВНУТРЕННИМИ КЛИЕНТАМИ. Мы транслируем требования конечного российского покупателя. Ваш доход напрямую зависит от того, сколько наших заказов вы качественно и вовремя отработаете.</w:t>
       </w:r>
     </w:p>
     <w:tbl>
@@ -418,398 +500,1229 @@
         <w:tblLook w:firstColumn="1" w:firstRow="1" w:lastColumn="0" w:lastRow="0" w:noHBand="0" w:noVBand="1" w:val="04A0"/>
       </w:tblPr>
       <w:tblGrid>
-        <w:gridCol w:w="9936"/>
+        <w:gridCol w:w="3360"/>
+        <w:gridCol w:w="3360"/>
+        <w:gridCol w:w="3360"/>
       </w:tblGrid>
       <w:tr>
         <w:tc>
           <w:tcPr>
-            <w:tcW w:type="dxa" w:w="9360"/>
-            <w:shd w:fill="F1F5F9"/>
+            <w:tcW w:type="dxa" w:w="2592"/>
+            <w:shd w:fill="1E3A8A"/>
             <w:tcMar>
               <w:top w:w="100" w:type="dxa"/>
               <w:bottom w:w="100" w:type="dxa"/>
-              <w:left w:w="140" w:type="dxa"/>
-              <w:right w:w="140" w:type="dxa"/>
+              <w:left w:w="120" w:type="dxa"/>
+              <w:right w:w="120" w:type="dxa"/>
             </w:tcMar>
           </w:tcPr>
           <w:p>
             <w:pPr>
-              <w:spacing w:after="40" w:line="276" w:lineRule="auto"/>
+              <w:spacing w:before="0" w:after="0"/>
+              <w:jc w:val="left"/>
             </w:pPr>
             <w:r>
               <w:rPr>
                 <w:b/>
-                <w:color w:val="0F172A"/>
-                <w:sz w:val="21"/>
+                <w:color w:val="FFFFFF"/>
+                <w:sz w:val="19"/>
               </w:rPr>
-              <w:t>📌 Табу на обман и неуважение</w:t>
-              <w:br/>
+              <w:t>Коллега / Роль</w:t>
             </w:r>
+          </w:p>
+        </w:tc>
+        <w:tc>
+          <w:tcPr>
+            <w:tcW w:type="dxa" w:w="4896"/>
+            <w:shd w:fill="1E3A8A"/>
+            <w:tcMar>
+              <w:top w:w="100" w:type="dxa"/>
+              <w:bottom w:w="100" w:type="dxa"/>
+              <w:left w:w="120" w:type="dxa"/>
+              <w:right w:w="120" w:type="dxa"/>
+            </w:tcMar>
+          </w:tcPr>
+          <w:p>
+            <w:pPr>
+              <w:spacing w:before="0" w:after="0"/>
+              <w:jc w:val="left"/>
+            </w:pPr>
             <w:r>
               <w:rPr>
-                <w:color w:val="334155"/>
+                <w:b/>
+                <w:color w:val="FFFFFF"/>
                 <w:sz w:val="19"/>
               </w:rPr>
-              <w:t>Железное правило основателя компании Артёма:</w:t>
-              <w:br/>
-              <w:t>Если завод или поставщик обманул — даже не в лоб, а например пообещал скидку, а потом не дал ее или дал формально, выказал неуважение, пренебрег нашей просьбой (а просим мы нечасто), дал слово и не сдержал его («поступил не по-пацански» и сделал вид, что так и надо, или отделался дежурным извинением) — С ТАКИМ ПОСТАВЩИКОМ МЫ БОЛЬШЕ НЕ РАБОТАЕМ НИКОГДА!</w:t>
-              <w:br/>
-              <w:t>Какой бы выгодной ни казалась цена, мы принципиально разрываем с ним отношения, даже если это идет в сиюминутный убыток компании.</w:t>
+              <w:t>Задачи и взаимодействие со снабжением</w:t>
+            </w:r>
+          </w:p>
+        </w:tc>
+        <w:tc>
+          <w:tcPr>
+            <w:tcW w:type="dxa" w:w="2592"/>
+            <w:shd w:fill="1E3A8A"/>
+            <w:tcMar>
+              <w:top w:w="100" w:type="dxa"/>
+              <w:bottom w:w="100" w:type="dxa"/>
+              <w:left w:w="120" w:type="dxa"/>
+              <w:right w:w="120" w:type="dxa"/>
+            </w:tcMar>
+          </w:tcPr>
+          <w:p>
+            <w:pPr>
+              <w:spacing w:before="0" w:after="0"/>
+              <w:jc w:val="left"/>
+            </w:pPr>
+            <w:r>
+              <w:rPr>
+                <w:b/>
+                <w:color w:val="FFFFFF"/>
+                <w:sz w:val="19"/>
+              </w:rPr>
+              <w:t>Важные правила</w:t>
+            </w:r>
+          </w:p>
+        </w:tc>
+      </w:tr>
+      <w:tr>
+        <w:tc>
+          <w:tcPr>
+            <w:tcW w:type="dxa" w:w="2592"/>
+            <w:shd w:fill="FFFFFF"/>
+            <w:tcMar>
+              <w:top w:w="80" w:type="dxa"/>
+              <w:bottom w:w="80" w:type="dxa"/>
+              <w:left w:w="120" w:type="dxa"/>
+              <w:right w:w="120" w:type="dxa"/>
+            </w:tcMar>
+          </w:tcPr>
+          <w:p>
+            <w:pPr>
+              <w:spacing w:before="0" w:after="0" w:line="276" w:lineRule="auto"/>
+            </w:pPr>
+            <w:r>
+              <w:rPr>
+                <w:sz w:val="18"/>
+              </w:rPr>
+              <w:t>Александра (Тендерный отдел / Внутренний Клиент)</w:t>
+            </w:r>
+          </w:p>
+        </w:tc>
+        <w:tc>
+          <w:tcPr>
+            <w:tcW w:type="dxa" w:w="4896"/>
+            <w:shd w:fill="FFFFFF"/>
+            <w:tcMar>
+              <w:top w:w="80" w:type="dxa"/>
+              <w:bottom w:w="80" w:type="dxa"/>
+              <w:left w:w="120" w:type="dxa"/>
+              <w:right w:w="120" w:type="dxa"/>
+            </w:tcMar>
+          </w:tcPr>
+          <w:p>
+            <w:pPr>
+              <w:spacing w:before="0" w:after="0" w:line="276" w:lineRule="auto"/>
+            </w:pPr>
+            <w:r>
+              <w:rPr>
+                <w:sz w:val="18"/>
+              </w:rPr>
+              <w:t>Ведущий специалист по государственным тендерам (АСТ ГОЗ). Главный внутренний клиент по закупкам станков и комплектующих для госпредприятий.</w:t>
+            </w:r>
+          </w:p>
+        </w:tc>
+        <w:tc>
+          <w:tcPr>
+            <w:tcW w:type="dxa" w:w="2592"/>
+            <w:shd w:fill="FFFFFF"/>
+            <w:tcMar>
+              <w:top w:w="80" w:type="dxa"/>
+              <w:bottom w:w="80" w:type="dxa"/>
+              <w:left w:w="120" w:type="dxa"/>
+              <w:right w:w="120" w:type="dxa"/>
+            </w:tcMar>
+          </w:tcPr>
+          <w:p>
+            <w:pPr>
+              <w:spacing w:before="0" w:after="0" w:line="276" w:lineRule="auto"/>
+            </w:pPr>
+            <w:r>
+              <w:rPr>
+                <w:sz w:val="18"/>
+              </w:rPr>
+              <w:t>Жесткие государственные дедлайны. Опоздание с расчетом означает проигрыш в конкурсе.</w:t>
+            </w:r>
+          </w:p>
+        </w:tc>
+      </w:tr>
+      <w:tr>
+        <w:tc>
+          <w:tcPr>
+            <w:tcW w:type="dxa" w:w="2592"/>
+            <w:shd w:fill="F8FAFC"/>
+            <w:tcMar>
+              <w:top w:w="80" w:type="dxa"/>
+              <w:bottom w:w="80" w:type="dxa"/>
+              <w:left w:w="120" w:type="dxa"/>
+              <w:right w:w="120" w:type="dxa"/>
+            </w:tcMar>
+          </w:tcPr>
+          <w:p>
+            <w:pPr>
+              <w:spacing w:before="0" w:after="0" w:line="276" w:lineRule="auto"/>
+            </w:pPr>
+            <w:r>
+              <w:rPr>
+                <w:sz w:val="18"/>
+              </w:rPr>
+              <w:t>Артём (Я / Руководитель компании)</w:t>
+            </w:r>
+          </w:p>
+        </w:tc>
+        <w:tc>
+          <w:tcPr>
+            <w:tcW w:type="dxa" w:w="4896"/>
+            <w:shd w:fill="F8FAFC"/>
+            <w:tcMar>
+              <w:top w:w="80" w:type="dxa"/>
+              <w:bottom w:w="80" w:type="dxa"/>
+              <w:left w:w="120" w:type="dxa"/>
+              <w:right w:w="120" w:type="dxa"/>
+            </w:tcMar>
+          </w:tcPr>
+          <w:p>
+            <w:pPr>
+              <w:spacing w:before="0" w:after="0" w:line="276" w:lineRule="auto"/>
+            </w:pPr>
+            <w:r>
+              <w:rPr>
+                <w:sz w:val="18"/>
+              </w:rPr>
+              <w:t>Руководитель компании. Ставит задачи по коммерческим заказчикам оборудования в РФ, контролирует маржинальность, цены и дисциплину.</w:t>
+            </w:r>
+          </w:p>
+        </w:tc>
+        <w:tc>
+          <w:tcPr>
+            <w:tcW w:type="dxa" w:w="2592"/>
+            <w:shd w:fill="F8FAFC"/>
+            <w:tcMar>
+              <w:top w:w="80" w:type="dxa"/>
+              <w:bottom w:w="80" w:type="dxa"/>
+              <w:left w:w="120" w:type="dxa"/>
+              <w:right w:w="120" w:type="dxa"/>
+            </w:tcMar>
+          </w:tcPr>
+          <w:p>
+            <w:pPr>
+              <w:spacing w:before="0" w:after="0" w:line="276" w:lineRule="auto"/>
+            </w:pPr>
+            <w:r>
+              <w:rPr>
+                <w:sz w:val="18"/>
+              </w:rPr>
+              <w:t>Не терпит сорванных дедлайнов и замалчивания проблем. Ценит честность и скорость.</w:t>
+            </w:r>
+          </w:p>
+        </w:tc>
+      </w:tr>
+      <w:tr>
+        <w:tc>
+          <w:tcPr>
+            <w:tcW w:type="dxa" w:w="2592"/>
+            <w:shd w:fill="FFFFFF"/>
+            <w:tcMar>
+              <w:top w:w="80" w:type="dxa"/>
+              <w:bottom w:w="80" w:type="dxa"/>
+              <w:left w:w="120" w:type="dxa"/>
+              <w:right w:w="120" w:type="dxa"/>
+            </w:tcMar>
+          </w:tcPr>
+          <w:p>
+            <w:pPr>
+              <w:spacing w:before="0" w:after="0" w:line="276" w:lineRule="auto"/>
+            </w:pPr>
+            <w:r>
+              <w:rPr>
+                <w:sz w:val="18"/>
+              </w:rPr>
+              <w:t>Анжелика (Логистика РФ / B2B-продажи)</w:t>
+            </w:r>
+          </w:p>
+        </w:tc>
+        <w:tc>
+          <w:tcPr>
+            <w:tcW w:type="dxa" w:w="4896"/>
+            <w:shd w:fill="FFFFFF"/>
+            <w:tcMar>
+              <w:top w:w="80" w:type="dxa"/>
+              <w:bottom w:w="80" w:type="dxa"/>
+              <w:left w:w="120" w:type="dxa"/>
+              <w:right w:w="120" w:type="dxa"/>
+            </w:tcMar>
+          </w:tcPr>
+          <w:p>
+            <w:pPr>
+              <w:spacing w:before="0" w:after="0" w:line="276" w:lineRule="auto"/>
+            </w:pPr>
+            <w:r>
+              <w:rPr>
+                <w:sz w:val="18"/>
+              </w:rPr>
+              <w:t>Главный логист в РФ и менеджер B2B-продаж. Принимает информацию о готовых грузах, организует растаможку и местную доставку клиентам в РФ.</w:t>
+            </w:r>
+          </w:p>
+        </w:tc>
+        <w:tc>
+          <w:tcPr>
+            <w:tcW w:type="dxa" w:w="2592"/>
+            <w:shd w:fill="FFFFFF"/>
+            <w:tcMar>
+              <w:top w:w="80" w:type="dxa"/>
+              <w:bottom w:w="80" w:type="dxa"/>
+              <w:left w:w="120" w:type="dxa"/>
+              <w:right w:w="120" w:type="dxa"/>
+            </w:tcMar>
+          </w:tcPr>
+          <w:p>
+            <w:pPr>
+              <w:spacing w:before="0" w:after="0" w:line="276" w:lineRule="auto"/>
+            </w:pPr>
+            <w:r>
+              <w:rPr>
+                <w:sz w:val="18"/>
+              </w:rPr>
+              <w:t>Требует точные габариты и вес брутто для таможенных расчетов.</w:t>
+            </w:r>
+          </w:p>
+        </w:tc>
+      </w:tr>
+      <w:tr>
+        <w:tc>
+          <w:tcPr>
+            <w:tcW w:type="dxa" w:w="2592"/>
+            <w:shd w:fill="F8FAFC"/>
+            <w:tcMar>
+              <w:top w:w="80" w:type="dxa"/>
+              <w:bottom w:w="80" w:type="dxa"/>
+              <w:left w:w="120" w:type="dxa"/>
+              <w:right w:w="120" w:type="dxa"/>
+            </w:tcMar>
+          </w:tcPr>
+          <w:p>
+            <w:pPr>
+              <w:spacing w:before="0" w:after="0" w:line="276" w:lineRule="auto"/>
+            </w:pPr>
+            <w:r>
+              <w:rPr>
+                <w:sz w:val="18"/>
+              </w:rPr>
+              <w:t>Азат (Снабжение / Старший куратор)</w:t>
+            </w:r>
+          </w:p>
+        </w:tc>
+        <w:tc>
+          <w:tcPr>
+            <w:tcW w:type="dxa" w:w="4896"/>
+            <w:shd w:fill="F8FAFC"/>
+            <w:tcMar>
+              <w:top w:w="80" w:type="dxa"/>
+              <w:bottom w:w="80" w:type="dxa"/>
+              <w:left w:w="120" w:type="dxa"/>
+              <w:right w:w="120" w:type="dxa"/>
+            </w:tcMar>
+          </w:tcPr>
+          <w:p>
+            <w:pPr>
+              <w:spacing w:before="0" w:after="0" w:line="276" w:lineRule="auto"/>
+            </w:pPr>
+            <w:r>
+              <w:rPr>
+                <w:sz w:val="18"/>
+              </w:rPr>
+              <w:t>Ведущий специалист по снабжению и старший наставник. Ваш технический щит: помогает при сложных чертежах, ГОСТах или спорах с заводами.</w:t>
+            </w:r>
+          </w:p>
+        </w:tc>
+        <w:tc>
+          <w:tcPr>
+            <w:tcW w:type="dxa" w:w="2592"/>
+            <w:shd w:fill="F8FAFC"/>
+            <w:tcMar>
+              <w:top w:w="80" w:type="dxa"/>
+              <w:bottom w:w="80" w:type="dxa"/>
+              <w:left w:w="120" w:type="dxa"/>
+              <w:right w:w="120" w:type="dxa"/>
+            </w:tcMar>
+          </w:tcPr>
+          <w:p>
+            <w:pPr>
+              <w:spacing w:before="0" w:after="0" w:line="276" w:lineRule="auto"/>
+            </w:pPr>
+            <w:r>
+              <w:rPr>
+                <w:sz w:val="18"/>
+              </w:rPr>
+              <w:t>Проверяет пульс задач в Битрикс24 дважды в день. Обращайтесь за советом с фактами.</w:t>
+            </w:r>
+          </w:p>
+        </w:tc>
+      </w:tr>
+      <w:tr>
+        <w:tc>
+          <w:tcPr>
+            <w:tcW w:type="dxa" w:w="2592"/>
+            <w:shd w:fill="FFFFFF"/>
+            <w:tcMar>
+              <w:top w:w="80" w:type="dxa"/>
+              <w:bottom w:w="80" w:type="dxa"/>
+              <w:left w:w="120" w:type="dxa"/>
+              <w:right w:w="120" w:type="dxa"/>
+            </w:tcMar>
+          </w:tcPr>
+          <w:p>
+            <w:pPr>
+              <w:spacing w:before="0" w:after="0" w:line="276" w:lineRule="auto"/>
+            </w:pPr>
+            <w:r>
+              <w:rPr>
+                <w:sz w:val="18"/>
+              </w:rPr>
+              <w:t>Ван (Miss Wang / user/30)</w:t>
+            </w:r>
+          </w:p>
+        </w:tc>
+        <w:tc>
+          <w:tcPr>
+            <w:tcW w:type="dxa" w:w="4896"/>
+            <w:shd w:fill="FFFFFF"/>
+            <w:tcMar>
+              <w:top w:w="80" w:type="dxa"/>
+              <w:bottom w:w="80" w:type="dxa"/>
+              <w:left w:w="120" w:type="dxa"/>
+              <w:right w:w="120" w:type="dxa"/>
+            </w:tcMar>
+          </w:tcPr>
+          <w:p>
+            <w:pPr>
+              <w:spacing w:before="0" w:after="0" w:line="276" w:lineRule="auto"/>
+            </w:pPr>
+            <w:r>
+              <w:rPr>
+                <w:sz w:val="18"/>
+              </w:rPr>
+              <w:t>Ваша напарница по закупкам. Делите объем 50/50, распределяете заявки, страхуете при перегрузках.</w:t>
+            </w:r>
+          </w:p>
+        </w:tc>
+        <w:tc>
+          <w:tcPr>
+            <w:tcW w:type="dxa" w:w="2592"/>
+            <w:shd w:fill="FFFFFF"/>
+            <w:tcMar>
+              <w:top w:w="80" w:type="dxa"/>
+              <w:bottom w:w="80" w:type="dxa"/>
+              <w:left w:w="120" w:type="dxa"/>
+              <w:right w:w="120" w:type="dxa"/>
+            </w:tcMar>
+          </w:tcPr>
+          <w:p>
+            <w:pPr>
+              <w:spacing w:before="0" w:after="0" w:line="276" w:lineRule="auto"/>
+            </w:pPr>
+            <w:r>
+              <w:rPr>
+                <w:sz w:val="18"/>
+              </w:rPr>
+              <w:t>Ежедневная координация и поддержка.</w:t>
+            </w:r>
+          </w:p>
+        </w:tc>
+      </w:tr>
+      <w:tr>
+        <w:tc>
+          <w:tcPr>
+            <w:tcW w:type="dxa" w:w="2592"/>
+            <w:shd w:fill="F8FAFC"/>
+            <w:tcMar>
+              <w:top w:w="80" w:type="dxa"/>
+              <w:bottom w:w="80" w:type="dxa"/>
+              <w:left w:w="120" w:type="dxa"/>
+              <w:right w:w="120" w:type="dxa"/>
+            </w:tcMar>
+          </w:tcPr>
+          <w:p>
+            <w:pPr>
+              <w:spacing w:before="0" w:after="0" w:line="276" w:lineRule="auto"/>
+            </w:pPr>
+            <w:r>
+              <w:rPr>
+                <w:sz w:val="18"/>
+              </w:rPr>
+              <w:t>Цянь Ин (Шеф-логист в КНР)</w:t>
+            </w:r>
+          </w:p>
+        </w:tc>
+        <w:tc>
+          <w:tcPr>
+            <w:tcW w:type="dxa" w:w="4896"/>
+            <w:shd w:fill="F8FAFC"/>
+            <w:tcMar>
+              <w:top w:w="80" w:type="dxa"/>
+              <w:bottom w:w="80" w:type="dxa"/>
+              <w:left w:w="120" w:type="dxa"/>
+              <w:right w:w="120" w:type="dxa"/>
+            </w:tcMar>
+          </w:tcPr>
+          <w:p>
+            <w:pPr>
+              <w:spacing w:before="0" w:after="0" w:line="276" w:lineRule="auto"/>
+            </w:pPr>
+            <w:r>
+              <w:rPr>
+                <w:sz w:val="18"/>
+              </w:rPr>
+              <w:t>Руководитель международной логистики в КНР. Обеспечивает прием товаров на партнерские склады консолидации и доставку в Россию.</w:t>
+            </w:r>
+          </w:p>
+        </w:tc>
+        <w:tc>
+          <w:tcPr>
+            <w:tcW w:type="dxa" w:w="2592"/>
+            <w:shd w:fill="F8FAFC"/>
+            <w:tcMar>
+              <w:top w:w="80" w:type="dxa"/>
+              <w:bottom w:w="80" w:type="dxa"/>
+              <w:left w:w="120" w:type="dxa"/>
+              <w:right w:w="120" w:type="dxa"/>
+            </w:tcMar>
+          </w:tcPr>
+          <w:p>
+            <w:pPr>
+              <w:spacing w:before="0" w:after="0" w:line="276" w:lineRule="auto"/>
+            </w:pPr>
+            <w:r>
+              <w:rPr>
+                <w:sz w:val="18"/>
+              </w:rPr>
+              <w:t>Передавайте ей контакты фабрик, вес брутто и габариты для организации вывоза.</w:t>
+            </w:r>
+          </w:p>
+        </w:tc>
+      </w:tr>
+      <w:tr>
+        <w:tc>
+          <w:tcPr>
+            <w:tcW w:type="dxa" w:w="2592"/>
+            <w:shd w:fill="FFFFFF"/>
+            <w:tcMar>
+              <w:top w:w="80" w:type="dxa"/>
+              <w:bottom w:w="80" w:type="dxa"/>
+              <w:left w:w="120" w:type="dxa"/>
+              <w:right w:w="120" w:type="dxa"/>
+            </w:tcMar>
+          </w:tcPr>
+          <w:p>
+            <w:pPr>
+              <w:spacing w:before="0" w:after="0" w:line="276" w:lineRule="auto"/>
+            </w:pPr>
+            <w:r>
+              <w:rPr>
+                <w:sz w:val="18"/>
+              </w:rPr>
+              <w:t>Лиень (user/44, логистическая поддержка / ассистент)</w:t>
+            </w:r>
+          </w:p>
+        </w:tc>
+        <w:tc>
+          <w:tcPr>
+            <w:tcW w:type="dxa" w:w="4896"/>
+            <w:shd w:fill="FFFFFF"/>
+            <w:tcMar>
+              <w:top w:w="80" w:type="dxa"/>
+              <w:bottom w:w="80" w:type="dxa"/>
+              <w:left w:w="120" w:type="dxa"/>
+              <w:right w:w="120" w:type="dxa"/>
+            </w:tcMar>
+          </w:tcPr>
+          <w:p>
+            <w:pPr>
+              <w:spacing w:before="0" w:after="0" w:line="276" w:lineRule="auto"/>
+            </w:pPr>
+            <w:r>
+              <w:rPr>
+                <w:sz w:val="18"/>
+              </w:rPr>
+              <w:t>Действующий логист и оперативный помощник снабжения. Помогает в прозвоне фабрик по Китаю, контроле соблюдения сроков производства (催交货期).</w:t>
+            </w:r>
+          </w:p>
+        </w:tc>
+        <w:tc>
+          <w:tcPr>
+            <w:tcW w:type="dxa" w:w="2592"/>
+            <w:shd w:fill="FFFFFF"/>
+            <w:tcMar>
+              <w:top w:w="80" w:type="dxa"/>
+              <w:bottom w:w="80" w:type="dxa"/>
+              <w:left w:w="120" w:type="dxa"/>
+              <w:right w:w="120" w:type="dxa"/>
+            </w:tcMar>
+          </w:tcPr>
+          <w:p>
+            <w:pPr>
+              <w:spacing w:before="0" w:after="0" w:line="276" w:lineRule="auto"/>
+            </w:pPr>
+            <w:r>
+              <w:rPr>
+                <w:sz w:val="18"/>
+              </w:rPr>
+              <w:t>Подключайте Лиень к срочным прозвонам заводов на местах.</w:t>
+            </w:r>
+          </w:p>
+        </w:tc>
+      </w:tr>
+      <w:tr>
+        <w:tc>
+          <w:tcPr>
+            <w:tcW w:type="dxa" w:w="2592"/>
+            <w:shd w:fill="F8FAFC"/>
+            <w:tcMar>
+              <w:top w:w="80" w:type="dxa"/>
+              <w:bottom w:w="80" w:type="dxa"/>
+              <w:left w:w="120" w:type="dxa"/>
+              <w:right w:w="120" w:type="dxa"/>
+            </w:tcMar>
+          </w:tcPr>
+          <w:p>
+            <w:pPr>
+              <w:spacing w:before="0" w:after="0" w:line="276" w:lineRule="auto"/>
+            </w:pPr>
+            <w:r>
+              <w:rPr>
+                <w:sz w:val="18"/>
+              </w:rPr>
+              <w:t>Ирина (Главный бухгалтер)</w:t>
+            </w:r>
+          </w:p>
+        </w:tc>
+        <w:tc>
+          <w:tcPr>
+            <w:tcW w:type="dxa" w:w="4896"/>
+            <w:shd w:fill="F8FAFC"/>
+            <w:tcMar>
+              <w:top w:w="80" w:type="dxa"/>
+              <w:bottom w:w="80" w:type="dxa"/>
+              <w:left w:w="120" w:type="dxa"/>
+              <w:right w:w="120" w:type="dxa"/>
+            </w:tcMar>
+          </w:tcPr>
+          <w:p>
+            <w:pPr>
+              <w:spacing w:before="0" w:after="0" w:line="276" w:lineRule="auto"/>
+            </w:pPr>
+            <w:r>
+              <w:rPr>
+                <w:sz w:val="18"/>
+              </w:rPr>
+              <w:t>Главный бухгалтер компании. Контролирует счета, реквизиты заводов и возврат экспортного НДС (13% 专票).</w:t>
+            </w:r>
+          </w:p>
+        </w:tc>
+        <w:tc>
+          <w:tcPr>
+            <w:tcW w:type="dxa" w:w="2592"/>
+            <w:shd w:fill="F8FAFC"/>
+            <w:tcMar>
+              <w:top w:w="80" w:type="dxa"/>
+              <w:bottom w:w="80" w:type="dxa"/>
+              <w:left w:w="120" w:type="dxa"/>
+              <w:right w:w="120" w:type="dxa"/>
+            </w:tcMar>
+          </w:tcPr>
+          <w:p>
+            <w:pPr>
+              <w:spacing w:before="0" w:after="0" w:line="276" w:lineRule="auto"/>
+            </w:pPr>
+            <w:r>
+              <w:rPr>
+                <w:sz w:val="18"/>
+              </w:rPr>
+              <w:t>Обязательно проверять 13% экспортные счета (专票).</w:t>
             </w:r>
           </w:p>
         </w:tc>
       </w:tr>
     </w:tbl>
-    <w:p/>
+    <w:p>
+      <w:pPr>
+        <w:spacing w:after="120"/>
+      </w:pPr>
+    </w:p>
     <w:p>
       <w:pPr>
         <w:keepNext/>
-        <w:spacing w:before="280" w:after="120"/>
+        <w:spacing w:before="280" w:after="80"/>
       </w:pPr>
       <w:r>
         <w:rPr>
-          <w:rFonts w:ascii="Calibri" w:hAnsi="Calibri"/>
           <w:b/>
-          <w:color w:val="0F2C59"/>
-          <w:sz w:val="28"/>
+          <w:color w:val="003366"/>
+          <w:sz w:val="25"/>
         </w:rPr>
-        <w:t>4. Требования к качеству, скорости и коммуникации</w:t>
+        <w:t>3. Стандарты честности и профессиональной этики с фабриками</w:t>
+      </w:r>
+    </w:p>
+    <w:p>
+      <w:pPr>
+        <w:spacing w:before="0" w:after="80" w:line="276" w:lineRule="auto"/>
+      </w:pPr>
+      <w:r>
+        <w:rPr>
+          <w:sz w:val="20"/>
+        </w:rPr>
+        <w:t>Важнейший базовый принцип основателя компании Артёма, определяющий деловую репутацию «Лун-Ван»:</w:t>
       </w:r>
     </w:p>
     <w:p>
       <w:pPr>
         <w:pStyle w:val="ListBullet"/>
-        <w:spacing w:after="60" w:line="276" w:lineRule="auto"/>
+        <w:spacing w:before="20" w:after="60" w:line="276" w:lineRule="auto"/>
       </w:pPr>
       <w:r>
         <w:rPr>
           <w:b/>
           <w:sz w:val="20"/>
         </w:rPr>
-        <w:t>1. Ответственность перед клиентом:</w:t>
+        <w:t xml:space="preserve">Принцип взаимного доверия: </w:t>
       </w:r>
       <w:r>
         <w:rPr>
           <w:sz w:val="20"/>
         </w:rPr>
-        <w:t xml:space="preserve"> Подвести клиента по срокам или качеству — смерти подобно. Привезти клиенту не то, что он просил — грубейшая ошибка. Мы отвечаем за каждое данное клиенту обещание.</w:t>
+        <w:t>Наш бизнес строится на взаимном доверии, порядочности и незыблемости данных обещаний. Мы работаем только с производителями, которые держат слово.</w:t>
       </w:r>
     </w:p>
     <w:p>
       <w:pPr>
         <w:pStyle w:val="ListBullet"/>
-        <w:spacing w:after="60" w:line="276" w:lineRule="auto"/>
+        <w:spacing w:before="20" w:after="60" w:line="276" w:lineRule="auto"/>
       </w:pPr>
       <w:r>
         <w:rPr>
           <w:b/>
           <w:sz w:val="20"/>
         </w:rPr>
-        <w:t>2. Запрет лишних расспросов и перевод ГОСТов:</w:t>
+        <w:t xml:space="preserve">Бескомпромиссный разрыв: </w:t>
       </w:r>
       <w:r>
         <w:rPr>
           <w:sz w:val="20"/>
         </w:rPr>
-        <w:t xml:space="preserve"> Избыток ненужных, пустых вопросов клиенту повышает риск его потери и разрушает репутацию компании. Менеджеры в России — продавцы, а не переводчики. Если в запросе указан русский ГОСТ или чертеж, самостоятельно переведите его через DeepSeek, выделите размеры, марку стали, вольтаж и задайте заводу конкретные вопросы.</w:t>
+        <w:t>Если фабрика или поставщик повел себя нечестно — например, пообещал скидку или срок готовности, а затем отказался от договоренности или предоставил ее лишь формально, выказал неуважение, пренебрег важной просьбой или нарушил слово — компания принципиально прекращает любое сотрудничество с таким заводом навсегда. Какой бы выгодной ни казалась цена, мы никогда не работаем с теми, кто не держит слово.</w:t>
+      </w:r>
+    </w:p>
+    <w:p>
+      <w:pPr>
+        <w:keepNext/>
+        <w:spacing w:before="280" w:after="80"/>
+      </w:pPr>
+      <w:r>
+        <w:rPr>
+          <w:b/>
+          <w:color w:val="003366"/>
+          <w:sz w:val="25"/>
+        </w:rPr>
+        <w:t>4. Операционные требования к качеству, скорости и коммуникации</w:t>
       </w:r>
     </w:p>
     <w:p>
       <w:pPr>
         <w:pStyle w:val="ListBullet"/>
-        <w:spacing w:after="60" w:line="276" w:lineRule="auto"/>
+        <w:spacing w:before="20" w:after="60" w:line="276" w:lineRule="auto"/>
       </w:pPr>
       <w:r>
         <w:rPr>
           <w:b/>
           <w:sz w:val="20"/>
         </w:rPr>
-        <w:t>3. Скорость — жизнь сделки:</w:t>
+        <w:t xml:space="preserve">1. Ответственность перед клиентом: </w:t>
       </w:r>
       <w:r>
         <w:rPr>
           <w:sz w:val="20"/>
         </w:rPr>
-        <w:t xml:space="preserve"> Готовить расчет 5 дней даже по 5 тендерам — непозволительная роскошь! Во многих случаях 1 дня вполне достаточно. Не загоняйте себя в искусственные рамки: получили задачу — как можно быстрее верните КП, желательно сразу с альтернативным производителем.</w:t>
+        <w:t>Подвести клиента по срокам или качеству — недопустимо. Привезти клиенту не то, что он заказывал — грубейшая ошибка. Мы отвечаем за каждое данное обязательство.</w:t>
       </w:r>
     </w:p>
     <w:p>
       <w:pPr>
         <w:pStyle w:val="ListBullet"/>
-        <w:spacing w:after="60" w:line="276" w:lineRule="auto"/>
+        <w:spacing w:before="20" w:after="60" w:line="276" w:lineRule="auto"/>
       </w:pPr>
       <w:r>
         <w:rPr>
           <w:b/>
           <w:sz w:val="20"/>
         </w:rPr>
-        <w:t>4. Категорический запрет откладывания:</w:t>
+        <w:t xml:space="preserve">2. Запрет лишних расспросов и перевод ГОСТов: </w:t>
       </w:r>
       <w:r>
         <w:rPr>
           <w:sz w:val="20"/>
         </w:rPr>
-        <w:t xml:space="preserve"> Если крайний срок через 3 дня — НЕЛЬЗЯ откладывать задачу до последнего момента! В 80% случаев это приводит к провалу: перед дедлайном всегда всплывают скрытые нестыковки. В коммерческих заказах клиент за 2–3 дня промедления просто покупает у конкурента.</w:t>
+        <w:t>Избыток ненужных, пустых вопросов клиенту повышает риск потери сделки и снижает доверие к компании. Менеджеры в России — продавцы, а не переводчики. Если в запросе указан русский ГОСТ или чертеж, самостоятельно переведите его через DeepSeek/ChatGPT, выделите размеры, марку стали, вольтаж (380В/50Гц) и задайте фабрике четкие вопросы.</w:t>
       </w:r>
     </w:p>
     <w:p>
       <w:pPr>
         <w:pStyle w:val="ListBullet"/>
-        <w:spacing w:after="60" w:line="276" w:lineRule="auto"/>
+        <w:spacing w:before="20" w:after="60" w:line="276" w:lineRule="auto"/>
       </w:pPr>
       <w:r>
         <w:rPr>
           <w:b/>
           <w:sz w:val="20"/>
         </w:rPr>
-        <w:t>5. Гибкость в переговорах и торг:</w:t>
+        <w:t xml:space="preserve">3. Скорость — жизнь сделки: </w:t>
       </w:r>
       <w:r>
         <w:rPr>
           <w:sz w:val="20"/>
         </w:rPr>
-        <w:t xml:space="preserve"> Торг с заводом необходим, но пережимать поставщика нельзя. Зафиксируйте факт, что торг возможен, узнайте минимальную планку цены при нашем объеме и укажите это в КП. Конкретную тактику переговоров выбирайте сами — пробуйте все разумные варианты.</w:t>
+        <w:t>Готовить расчет 5 дней даже по 5 тендерам — непозволительная роскошь! Во многих случаях 1–2 дней вполне достаточно. Не затягивайте расчеты: получили задачу — как можно быстрее верните КП, желательно сразу с альтернативным производителем.</w:t>
       </w:r>
     </w:p>
     <w:p>
       <w:pPr>
         <w:pStyle w:val="ListBullet"/>
-        <w:spacing w:after="60" w:line="276" w:lineRule="auto"/>
+        <w:spacing w:before="20" w:after="60" w:line="276" w:lineRule="auto"/>
       </w:pPr>
       <w:r>
         <w:rPr>
           <w:b/>
           <w:sz w:val="20"/>
         </w:rPr>
-        <w:t>6. Габариты и сроки:</w:t>
+        <w:t xml:space="preserve">4. Категорический запрет откладывания: </w:t>
       </w:r>
       <w:r>
         <w:rPr>
           <w:sz w:val="20"/>
         </w:rPr>
-        <w:t xml:space="preserve"> На этапе первичного КП допустима погрешность 5–15%. Главное — сразу понять и зафиксировать, есть ли негабарит (длина, вес, высота), и точный срок поставки от завода. Абсолютно точные аппаратные замеры снимут позже на партнерском складе консолидации.</w:t>
+        <w:t>Если крайний срок через 3 дня — НЕЛЬЗЯ откладывать задачу до последнего момента! В 80% случаев это приводит к провалу: перед дедлайном всегда всплывают скрытые нестыковки. В коммерческих заказах клиент за 2–3 дня промедления просто покупает у конкурента.</w:t>
       </w:r>
     </w:p>
     <w:p>
       <w:pPr>
         <w:pStyle w:val="ListBullet"/>
-        <w:spacing w:after="60" w:line="276" w:lineRule="auto"/>
+        <w:spacing w:before="20" w:after="60" w:line="276" w:lineRule="auto"/>
       </w:pPr>
       <w:r>
         <w:rPr>
           <w:b/>
           <w:sz w:val="20"/>
         </w:rPr>
-        <w:t>7. Понимание приоритетов и обратная связь:</w:t>
+        <w:t xml:space="preserve">5. Гибкость в переговорах и торг: </w:t>
       </w:r>
       <w:r>
         <w:rPr>
           <w:sz w:val="20"/>
         </w:rPr>
-        <w:t xml:space="preserve"> Если задача не ясна — спросите сразу. Если задача заведомо невыполнима — скажите об этом прямо и немедленно. Приоритеты задач нужно уточнять у руководителя или Азата, если они не очевидны.</w:t>
+        <w:t>Торг с заводом необходим, но пережимать поставщика нельзя. Зафиксируйте факт, что торг возможен, узнайте минимальную планку цены при нашем объеме и укажите это в КП. Конкретную тактику переговоров выбирайте сами.</w:t>
       </w:r>
     </w:p>
     <w:p>
       <w:pPr>
         <w:pStyle w:val="ListBullet"/>
-        <w:spacing w:after="60" w:line="276" w:lineRule="auto"/>
+        <w:spacing w:before="20" w:after="60" w:line="276" w:lineRule="auto"/>
       </w:pPr>
       <w:r>
         <w:rPr>
           <w:b/>
           <w:sz w:val="20"/>
         </w:rPr>
-        <w:t>8. Язык работы:</w:t>
+        <w:t xml:space="preserve">6. Габариты и сроки: </w:t>
       </w:r>
       <w:r>
         <w:rPr>
           <w:sz w:val="20"/>
         </w:rPr>
-        <w:t xml:space="preserve"> Мы пишем вам в чатах Битрикс24 по-китайски (на русском — только в спешке). Исходные ТЗ, спецификации и документы клиентов отправляем в оригинале на русском языке.</w:t>
-      </w:r>
-    </w:p>
-    <w:p>
-      <w:pPr>
-        <w:keepNext/>
-        <w:spacing w:before="280" w:after="120"/>
-      </w:pPr>
-      <w:r>
-        <w:rPr>
-          <w:rFonts w:ascii="Calibri" w:hAnsi="Calibri"/>
-          <w:b/>
-          <w:color w:val="0F2C59"/>
-          <w:sz w:val="28"/>
-        </w:rPr>
-        <w:t>5. Рабочий спринт на первые две недели (Без давления цифрами)</w:t>
-      </w:r>
-    </w:p>
-    <w:p>
-      <w:pPr>
-        <w:spacing w:after="80" w:line="276" w:lineRule="auto"/>
-      </w:pPr>
-      <w:r>
-        <w:rPr>
-          <w:i w:val="0"/>
-          <w:sz w:val="20"/>
-        </w:rPr>
-        <w:t>Мы не ограничиваем вас искусственными цифрами. Делайте ВСЕ поступающие заявки качественно и оперативно. Главное — впитать опыт коллег, понять дисциплину и нарабатывать базу надежных фабрик:</w:t>
+        <w:t>На этапе первичного КП допустима погрешность 5–15%. Главное — сразу зафиксировать, есть ли негабарит (длина, вес, высота), и точный срок производства от завода.</w:t>
       </w:r>
     </w:p>
     <w:p>
       <w:pPr>
         <w:pStyle w:val="ListBullet"/>
-        <w:spacing w:after="60" w:line="276" w:lineRule="auto"/>
+        <w:spacing w:before="20" w:after="60" w:line="276" w:lineRule="auto"/>
       </w:pPr>
       <w:r>
         <w:rPr>
           <w:b/>
           <w:sz w:val="20"/>
         </w:rPr>
-        <w:t>День 1:</w:t>
+        <w:t xml:space="preserve">7. Корень, а не листья: </w:t>
       </w:r>
       <w:r>
         <w:rPr>
           <w:sz w:val="20"/>
         </w:rPr>
-        <w:t xml:space="preserve"> Знакомство с Битрикс24, каналами связи, созвон с Азатом и напарницей Ван по распределению задач.</w:t>
+        <w:t>Ищите станок, а не перекупщика с 1688. Запрашивайте у завода видео цеха, фото работающих станков и заводской шильдик с техническими параметрами (вольтаж 380В/50Гц, мощность, обороты).</w:t>
       </w:r>
     </w:p>
     <w:p>
       <w:pPr>
         <w:pStyle w:val="ListBullet"/>
-        <w:spacing w:after="60" w:line="276" w:lineRule="auto"/>
+        <w:spacing w:before="20" w:after="60" w:line="276" w:lineRule="auto"/>
       </w:pPr>
       <w:r>
         <w:rPr>
           <w:b/>
           <w:sz w:val="20"/>
         </w:rPr>
-        <w:t>День 2:</w:t>
+        <w:t xml:space="preserve">8. Чистые счета с 13% НДС: </w:t>
       </w:r>
       <w:r>
         <w:rPr>
           <w:sz w:val="20"/>
         </w:rPr>
-        <w:t xml:space="preserve"> Принятие в работу поступивших заявок от Александры (тендеры) и Артёма (коммерческие заказы).</w:t>
+        <w:t>Четко разделяйте белый экспорт с 13% НДС (专票) и карго без документов. Ошибка в форме счета лишает компанию возврата налога.</w:t>
       </w:r>
     </w:p>
     <w:p>
       <w:pPr>
-        <w:pStyle w:val="ListBullet"/>
-        <w:spacing w:after="60" w:line="276" w:lineRule="auto"/>
+        <w:keepNext/>
+        <w:spacing w:before="280" w:after="80"/>
       </w:pPr>
       <w:r>
         <w:rPr>
           <w:b/>
-          <w:sz w:val="20"/>
+          <w:color w:val="003366"/>
+          <w:sz w:val="25"/>
         </w:rPr>
-        <w:t>День 3:</w:t>
+        <w:t>5. Рабочий спринт на первую и вторую недели (Без давления цифрами)</w:t>
       </w:r>
+    </w:p>
+    <w:p>
+      <w:pPr>
+        <w:spacing w:before="0" w:after="80" w:line="276" w:lineRule="auto"/>
+      </w:pPr>
       <w:r>
         <w:rPr>
           <w:sz w:val="20"/>
         </w:rPr>
-        <w:t xml:space="preserve"> Практика поиска прямых фабрик, перевод русских ТЗ через DeepSeek, фиксация сроков и проверка на негабарит.</w:t>
+        <w:t>Мы не устанавливаем для вас искусственных числовых норм на первые недели. Делайте ВСЕ поступающие заявки качественно, быстро и без остатка. Главная цель — войти в рабочий ритм, понять требования и наработать надежный пул поставщиков:</w:t>
       </w:r>
     </w:p>
+    <w:tbl>
+      <w:tblPr>
+        <w:tblW w:type="auto" w:w="0"/>
+        <w:jc w:val="center"/>
+        <w:tblLook w:firstColumn="1" w:firstRow="1" w:lastColumn="0" w:lastRow="0" w:noHBand="0" w:noVBand="1" w:val="04A0"/>
+      </w:tblPr>
+      <w:tblGrid>
+        <w:gridCol w:w="3360"/>
+        <w:gridCol w:w="3360"/>
+        <w:gridCol w:w="3360"/>
+      </w:tblGrid>
+      <w:tr>
+        <w:tc>
+          <w:tcPr>
+            <w:tcW w:type="dxa" w:w="2160"/>
+            <w:shd w:fill="1E3A8A"/>
+            <w:tcMar>
+              <w:top w:w="100" w:type="dxa"/>
+              <w:bottom w:w="100" w:type="dxa"/>
+              <w:left w:w="120" w:type="dxa"/>
+              <w:right w:w="120" w:type="dxa"/>
+            </w:tcMar>
+          </w:tcPr>
+          <w:p>
+            <w:pPr>
+              <w:spacing w:before="0" w:after="0"/>
+              <w:jc w:val="left"/>
+            </w:pPr>
+            <w:r>
+              <w:rPr>
+                <w:b/>
+                <w:color w:val="FFFFFF"/>
+                <w:sz w:val="19"/>
+              </w:rPr>
+              <w:t>Период / 时间</w:t>
+            </w:r>
+          </w:p>
+        </w:tc>
+        <w:tc>
+          <w:tcPr>
+            <w:tcW w:type="dxa" w:w="5760"/>
+            <w:shd w:fill="1E3A8A"/>
+            <w:tcMar>
+              <w:top w:w="100" w:type="dxa"/>
+              <w:bottom w:w="100" w:type="dxa"/>
+              <w:left w:w="120" w:type="dxa"/>
+              <w:right w:w="120" w:type="dxa"/>
+            </w:tcMar>
+          </w:tcPr>
+          <w:p>
+            <w:pPr>
+              <w:spacing w:before="0" w:after="0"/>
+              <w:jc w:val="left"/>
+            </w:pPr>
+            <w:r>
+              <w:rPr>
+                <w:b/>
+                <w:color w:val="FFFFFF"/>
+                <w:sz w:val="19"/>
+              </w:rPr>
+              <w:t>Ключевые практические действия / 具体任务</w:t>
+            </w:r>
+          </w:p>
+        </w:tc>
+        <w:tc>
+          <w:tcPr>
+            <w:tcW w:type="dxa" w:w="2160"/>
+            <w:shd w:fill="1E3A8A"/>
+            <w:tcMar>
+              <w:top w:w="100" w:type="dxa"/>
+              <w:bottom w:w="100" w:type="dxa"/>
+              <w:left w:w="120" w:type="dxa"/>
+              <w:right w:w="120" w:type="dxa"/>
+            </w:tcMar>
+          </w:tcPr>
+          <w:p>
+            <w:pPr>
+              <w:spacing w:before="0" w:after="0"/>
+              <w:jc w:val="left"/>
+            </w:pPr>
+            <w:r>
+              <w:rPr>
+                <w:b/>
+                <w:color w:val="FFFFFF"/>
+                <w:sz w:val="19"/>
+              </w:rPr>
+              <w:t>Ожидаемый результат / 交付成果</w:t>
+            </w:r>
+          </w:p>
+        </w:tc>
+      </w:tr>
+      <w:tr>
+        <w:tc>
+          <w:tcPr>
+            <w:tcW w:type="dxa" w:w="2160"/>
+            <w:shd w:fill="FFFFFF"/>
+            <w:tcMar>
+              <w:top w:w="80" w:type="dxa"/>
+              <w:bottom w:w="80" w:type="dxa"/>
+              <w:left w:w="120" w:type="dxa"/>
+              <w:right w:w="120" w:type="dxa"/>
+            </w:tcMar>
+          </w:tcPr>
+          <w:p>
+            <w:pPr>
+              <w:spacing w:before="0" w:after="0" w:line="276" w:lineRule="auto"/>
+            </w:pPr>
+            <w:r>
+              <w:rPr>
+                <w:sz w:val="18"/>
+              </w:rPr>
+              <w:t>Неделя 1</w:t>
+              <w:br/>
+              <w:t>(Дни 1–5)</w:t>
+            </w:r>
+          </w:p>
+        </w:tc>
+        <w:tc>
+          <w:tcPr>
+            <w:tcW w:type="dxa" w:w="5760"/>
+            <w:shd w:fill="FFFFFF"/>
+            <w:tcMar>
+              <w:top w:w="80" w:type="dxa"/>
+              <w:bottom w:w="80" w:type="dxa"/>
+              <w:left w:w="120" w:type="dxa"/>
+              <w:right w:w="120" w:type="dxa"/>
+            </w:tcMar>
+          </w:tcPr>
+          <w:p>
+            <w:pPr>
+              <w:spacing w:before="0" w:after="0" w:line="276" w:lineRule="auto"/>
+            </w:pPr>
+            <w:r>
+              <w:rPr>
+                <w:sz w:val="18"/>
+              </w:rPr>
+              <w:t>1. Вход в Битрикс24 по инструкции, настройка профиля и уведомлений.</w:t>
+              <w:br/>
+              <w:t>2. Изучение типового шаблона задачи №66 «Поиск товара/запрос поставщику 搜品/向供应商询价».</w:t>
+              <w:br/>
+              <w:t>3. Знакомство с напарницей Ван и старшим куратором Азатом: распределение текущего потока заявок 50/50.</w:t>
+              <w:br/>
+              <w:t>4. Оперативная отработка ВСЕХ поступающих заявок на закупку оборудования от Александры и Артёма.</w:t>
+              <w:br/>
+              <w:t>5. Занесение всех найденных проверенных фабрик в CRM Битрикс24 (раздел «Компании»).</w:t>
+            </w:r>
+          </w:p>
+        </w:tc>
+        <w:tc>
+          <w:tcPr>
+            <w:tcW w:type="dxa" w:w="2160"/>
+            <w:shd w:fill="FFFFFF"/>
+            <w:tcMar>
+              <w:top w:w="80" w:type="dxa"/>
+              <w:bottom w:w="80" w:type="dxa"/>
+              <w:left w:w="120" w:type="dxa"/>
+              <w:right w:w="120" w:type="dxa"/>
+            </w:tcMar>
+          </w:tcPr>
+          <w:p>
+            <w:pPr>
+              <w:spacing w:before="0" w:after="0" w:line="276" w:lineRule="auto"/>
+            </w:pPr>
+            <w:r>
+              <w:rPr>
+                <w:sz w:val="18"/>
+              </w:rPr>
+              <w:t>Освоен рабочий процесс в Битрикс24, отработаны все входящие задачи, занесены первые карточки фабрик в CRM.</w:t>
+            </w:r>
+          </w:p>
+        </w:tc>
+      </w:tr>
+      <w:tr>
+        <w:tc>
+          <w:tcPr>
+            <w:tcW w:type="dxa" w:w="2160"/>
+            <w:shd w:fill="F8FAFC"/>
+            <w:tcMar>
+              <w:top w:w="80" w:type="dxa"/>
+              <w:bottom w:w="80" w:type="dxa"/>
+              <w:left w:w="120" w:type="dxa"/>
+              <w:right w:w="120" w:type="dxa"/>
+            </w:tcMar>
+          </w:tcPr>
+          <w:p>
+            <w:pPr>
+              <w:spacing w:before="0" w:after="0" w:line="276" w:lineRule="auto"/>
+            </w:pPr>
+            <w:r>
+              <w:rPr>
+                <w:sz w:val="18"/>
+              </w:rPr>
+              <w:t>Неделя 2</w:t>
+              <w:br/>
+              <w:t>(Дни 6–10)</w:t>
+            </w:r>
+          </w:p>
+        </w:tc>
+        <w:tc>
+          <w:tcPr>
+            <w:tcW w:type="dxa" w:w="5760"/>
+            <w:shd w:fill="F8FAFC"/>
+            <w:tcMar>
+              <w:top w:w="80" w:type="dxa"/>
+              <w:bottom w:w="80" w:type="dxa"/>
+              <w:left w:w="120" w:type="dxa"/>
+              <w:right w:w="120" w:type="dxa"/>
+            </w:tcMar>
+          </w:tcPr>
+          <w:p>
+            <w:pPr>
+              <w:spacing w:before="0" w:after="0" w:line="276" w:lineRule="auto"/>
+            </w:pPr>
+            <w:r>
+              <w:rPr>
+                <w:sz w:val="18"/>
+              </w:rPr>
+              <w:t>1. Сокращение времени предоставления первичного КП до стандартов компании (24–48 часов).</w:t>
+              <w:br/>
+              <w:t>2. Предоставление минимум 2 альтернативных коммерческих предложений от реальных заводов на каждую заявку.</w:t>
+              <w:br/>
+              <w:t>3. Отработка торга с фабриками с фиксацией минимальной цены при объеме.</w:t>
+              <w:br/>
+              <w:t>4. Четкая передача данных по готовым грузам логистам (Цянь Ин и Лиень): вес брутто, Д×Ш×В ящиков, адрес цеха.</w:t>
+              <w:br/>
+              <w:t>5. Ежедневное обновление статусов задач в Битрикс24 строго до 18:00 по китайскому времени.</w:t>
+            </w:r>
+          </w:p>
+        </w:tc>
+        <w:tc>
+          <w:tcPr>
+            <w:tcW w:type="dxa" w:w="2160"/>
+            <w:shd w:fill="F8FAFC"/>
+            <w:tcMar>
+              <w:top w:w="80" w:type="dxa"/>
+              <w:bottom w:w="80" w:type="dxa"/>
+              <w:left w:w="120" w:type="dxa"/>
+              <w:right w:w="120" w:type="dxa"/>
+            </w:tcMar>
+          </w:tcPr>
+          <w:p>
+            <w:pPr>
+              <w:spacing w:before="0" w:after="0" w:line="276" w:lineRule="auto"/>
+            </w:pPr>
+            <w:r>
+              <w:rPr>
+                <w:sz w:val="18"/>
+              </w:rPr>
+              <w:t>Снабжение работает в ритме 1–2 дня на расчет, все КП содержат $\ge 2$ фабрик с 13% НДС и габаритами, дедлайны соблюдены.</w:t>
+            </w:r>
+          </w:p>
+        </w:tc>
+      </w:tr>
+    </w:tbl>
     <w:p>
       <w:pPr>
-        <w:pStyle w:val="ListBullet"/>
-        <w:spacing w:after="60" w:line="276" w:lineRule="auto"/>
+        <w:spacing w:after="120"/>
       </w:pPr>
-      <w:r>
-        <w:rPr>
-          <w:b/>
-          <w:sz w:val="20"/>
-        </w:rPr>
-        <w:t>День 4:</w:t>
-      </w:r>
-      <w:r>
-        <w:rPr>
-          <w:sz w:val="20"/>
-        </w:rPr>
-        <w:t xml:space="preserve"> Переговоры с заводами, фиксация возможности скидки, соблюдение принципа честности поставщика.</w:t>
-      </w:r>
     </w:p>
+    <w:tbl>
+      <w:tblPr>
+        <w:tblW w:type="auto" w:w="0"/>
+        <w:jc w:val="center"/>
+        <w:tblLook w:firstColumn="1" w:firstRow="1" w:lastColumn="0" w:lastRow="0" w:noHBand="0" w:noVBand="1" w:val="04A0"/>
+      </w:tblPr>
+      <w:tblGrid>
+        <w:gridCol w:w="10080"/>
+      </w:tblGrid>
+      <w:tr>
+        <w:tc>
+          <w:tcPr>
+            <w:tcW w:type="dxa" w:w="10080"/>
+            <w:shd w:fill="F2F5F9"/>
+            <w:tcMar>
+              <w:top w:w="120" w:type="dxa"/>
+              <w:bottom w:w="120" w:type="dxa"/>
+              <w:left w:w="180" w:type="dxa"/>
+              <w:right w:w="180" w:type="dxa"/>
+            </w:tcMar>
+          </w:tcPr>
+          <w:p>
+            <w:pPr>
+              <w:spacing w:before="0" w:after="0" w:line="276" w:lineRule="auto"/>
+            </w:pPr>
+            <w:r>
+              <w:rPr>
+                <w:b/>
+                <w:color w:val="003366"/>
+                <w:sz w:val="20"/>
+              </w:rPr>
+              <w:t xml:space="preserve">ПРИНЦИП ОТКРЫТОСТИ: </w:t>
+            </w:r>
+            <w:r>
+              <w:rPr>
+                <w:i/>
+                <w:sz w:val="19"/>
+              </w:rPr>
+              <w:t>Если задача не ясна — спросите сразу в комментариях Битрикс24. Если задача заведомо невыполнима — скажите об этом прямо и немедленно. Мы ждем от вас инициативы, энергии и профессионализма!</w:t>
+            </w:r>
+          </w:p>
+        </w:tc>
+      </w:tr>
+    </w:tbl>
     <w:p>
       <w:pPr>
-        <w:pStyle w:val="ListBullet"/>
-        <w:spacing w:after="60" w:line="276" w:lineRule="auto"/>
+        <w:spacing w:after="80"/>
       </w:pPr>
-      <w:r>
-        <w:rPr>
-          <w:b/>
-          <w:sz w:val="20"/>
-        </w:rPr>
-        <w:t>День 5:</w:t>
-      </w:r>
-      <w:r>
-        <w:rPr>
-          <w:sz w:val="20"/>
-        </w:rPr>
-        <w:t xml:space="preserve"> Сдача расчетов в Битрикс24 в кратчайшие сроки (по возможности с альтернативами). Разбор с Азатом.</w:t>
-      </w:r>
-    </w:p>
-    <w:p>
-      <w:pPr>
-        <w:pStyle w:val="ListBullet"/>
-        <w:spacing w:after="60" w:line="276" w:lineRule="auto"/>
-      </w:pPr>
-      <w:r>
-        <w:rPr>
-          <w:b/>
-          <w:sz w:val="20"/>
-        </w:rPr>
-        <w:t>Дни 6-7:</w:t>
-      </w:r>
-      <w:r>
-        <w:rPr>
-          <w:sz w:val="20"/>
-        </w:rPr>
-        <w:t xml:space="preserve"> Полноценная работа в потоке 50/50 наравне с Ван: быстрые расчеты за 1–2 дня.</w:t>
-      </w:r>
-    </w:p>
-    <w:p>
-      <w:pPr>
-        <w:pStyle w:val="ListBullet"/>
-        <w:spacing w:after="60" w:line="276" w:lineRule="auto"/>
-      </w:pPr>
-      <w:r>
-        <w:rPr>
-          <w:b/>
-          <w:sz w:val="20"/>
-        </w:rPr>
-        <w:t>Дни 8-9:</w:t>
-      </w:r>
-      <w:r>
-        <w:rPr>
-          <w:sz w:val="20"/>
-        </w:rPr>
-        <w:t xml:space="preserve"> Взаимодействие с Лиень: подключение ее к прозвону фабрик и контролю сроков готовности (催交货期).</w:t>
-      </w:r>
-    </w:p>
-    <w:p>
-      <w:pPr>
-        <w:pStyle w:val="ListBullet"/>
-        <w:spacing w:after="60" w:line="276" w:lineRule="auto"/>
-      </w:pPr>
-      <w:r>
-        <w:rPr>
-          <w:b/>
-          <w:sz w:val="20"/>
-        </w:rPr>
-        <w:t>День 10:</w:t>
-      </w:r>
-      <w:r>
-        <w:rPr>
-          <w:sz w:val="20"/>
-        </w:rPr>
-        <w:t xml:space="preserve"> Подведение итогов спринта с Азатом и Артёмом: демонстрация наработанных фабрик, предложений и разбор сложных моментов.</w:t>
-      </w:r>
     </w:p>
     <w:sectPr>
       <w:pgSz w:w="12240" w:h="15840"/>
-      <w:pgMar w:top="1152" w:right="1152" w:bottom="1152" w:left="1152" w:header="720" w:footer="720" w:gutter="0"/>
+      <w:pgMar w:top="1008" w:right="1080" w:bottom="1008" w:left="1080" w:header="720" w:footer="720" w:gutter="0"/>
       <w:cols w:space="720"/>
       <w:docGrid w:linePitch="360"/>
     </w:sectPr>
@@ -1180,6 +2093,11 @@
     <w:name w:val="Normal"/>
     <w:qFormat/>
     <w:rsid w:val="00FC693F"/>
+    <w:rPr>
+      <w:rFonts w:ascii="Arial" w:hAnsi="Arial"/>
+      <w:color w:val="222222"/>
+      <w:sz w:val="20"/>
+    </w:rPr>
   </w:style>
   <w:style w:type="paragraph" w:styleId="Header">
     <w:name w:val="header"/>

</xml_diff>

<commit_message>
feat(hr): add china onboarding compiler, update briefs, b24 guide and incident log
</commit_message>
<xml_diff>
--- a/projects/HR/Китайский снабженец/Вводный_инструктаж_и_спринт_Ли_Юйнань_Снабжение.docx
+++ b/projects/HR/Китайский снабженец/Вводный_инструктаж_и_спринт_Ли_Юйнань_Снабжение.docx
@@ -20,7 +20,7 @@
         <w:rPr>
           <w:i/>
           <w:color w:val="555555"/>
-          <w:sz w:val="21"/>
+          <w:sz w:val="20"/>
         </w:rPr>
         <w:t>Организация работы снабжения, стандарты взаимодействия с клиентами и фабриками</w:t>
         <w:br/>
@@ -40,7 +40,7 @@
       <w:tr>
         <w:tc>
           <w:tcPr>
-            <w:tcW w:type="dxa" w:w="3312"/>
+            <w:tcW w:type="dxa" w:w="5040"/>
             <w:shd w:fill="1E3A8A"/>
             <w:tcMar>
               <w:top w:w="100" w:type="dxa"/>
@@ -66,7 +66,7 @@
         </w:tc>
         <w:tc>
           <w:tcPr>
-            <w:tcW w:type="dxa" w:w="6768"/>
+            <w:tcW w:type="dxa" w:w="5040"/>
             <w:shd w:fill="1E3A8A"/>
             <w:tcMar>
               <w:top w:w="100" w:type="dxa"/>
@@ -94,7 +94,7 @@
       <w:tr>
         <w:tc>
           <w:tcPr>
-            <w:tcW w:type="dxa" w:w="3312"/>
+            <w:tcW w:type="dxa" w:w="5040"/>
             <w:shd w:fill="FFFFFF"/>
             <w:tcMar>
               <w:top w:w="80" w:type="dxa"/>
@@ -111,13 +111,13 @@
               <w:rPr>
                 <w:sz w:val="18"/>
               </w:rPr>
-              <w:t>Сотрудник / Адресат:</w:t>
+              <w:t>**Сотрудник / Адресат:**</w:t>
             </w:r>
           </w:p>
         </w:tc>
         <w:tc>
           <w:tcPr>
-            <w:tcW w:type="dxa" w:w="6768"/>
+            <w:tcW w:type="dxa" w:w="5040"/>
             <w:shd w:fill="FFFFFF"/>
             <w:tcMar>
               <w:top w:w="80" w:type="dxa"/>
@@ -134,7 +134,7 @@
               <w:rPr>
                 <w:sz w:val="18"/>
               </w:rPr>
-              <w:t>Ли Юйнань (李玉南 / Ms. An #31)</w:t>
+              <w:t>**Ли Юйнань (李玉南 / Ms. An #31)**</w:t>
             </w:r>
           </w:p>
         </w:tc>
@@ -142,7 +142,7 @@
       <w:tr>
         <w:tc>
           <w:tcPr>
-            <w:tcW w:type="dxa" w:w="3312"/>
+            <w:tcW w:type="dxa" w:w="5040"/>
             <w:shd w:fill="F8FAFC"/>
             <w:tcMar>
               <w:top w:w="80" w:type="dxa"/>
@@ -159,13 +159,13 @@
               <w:rPr>
                 <w:sz w:val="18"/>
               </w:rPr>
-              <w:t>Должность и статус:</w:t>
+              <w:t>**Должность и статус:**</w:t>
             </w:r>
           </w:p>
         </w:tc>
         <w:tc>
           <w:tcPr>
-            <w:tcW w:type="dxa" w:w="6768"/>
+            <w:tcW w:type="dxa" w:w="5040"/>
             <w:shd w:fill="F8FAFC"/>
             <w:tcMar>
               <w:top w:w="80" w:type="dxa"/>
@@ -182,7 +182,7 @@
               <w:rPr>
                 <w:sz w:val="18"/>
               </w:rPr>
-              <w:t>Специалист по снабжению и закупкам промышленного оборудования в КНР</w:t>
+              <w:t>**Специалист по снабжению и закупкам промышленного оборудования в КНР**</w:t>
             </w:r>
           </w:p>
         </w:tc>
@@ -190,7 +190,7 @@
       <w:tr>
         <w:tc>
           <w:tcPr>
-            <w:tcW w:type="dxa" w:w="3312"/>
+            <w:tcW w:type="dxa" w:w="5040"/>
             <w:shd w:fill="FFFFFF"/>
             <w:tcMar>
               <w:top w:w="80" w:type="dxa"/>
@@ -207,13 +207,13 @@
               <w:rPr>
                 <w:sz w:val="18"/>
               </w:rPr>
-              <w:t>Локация и формат:</w:t>
+              <w:t>**Локация и формат:**</w:t>
             </w:r>
           </w:p>
         </w:tc>
         <w:tc>
           <w:tcPr>
-            <w:tcW w:type="dxa" w:w="6768"/>
+            <w:tcW w:type="dxa" w:w="5040"/>
             <w:shd w:fill="FFFFFF"/>
             <w:tcMar>
               <w:top w:w="80" w:type="dxa"/>
@@ -238,7 +238,7 @@
       <w:tr>
         <w:tc>
           <w:tcPr>
-            <w:tcW w:type="dxa" w:w="3312"/>
+            <w:tcW w:type="dxa" w:w="5040"/>
             <w:shd w:fill="F8FAFC"/>
             <w:tcMar>
               <w:top w:w="80" w:type="dxa"/>
@@ -255,13 +255,13 @@
               <w:rPr>
                 <w:sz w:val="18"/>
               </w:rPr>
-              <w:t>Внутренние заказчики:</w:t>
+              <w:t>**Внутренние заказчики:**</w:t>
             </w:r>
           </w:p>
         </w:tc>
         <w:tc>
           <w:tcPr>
-            <w:tcW w:type="dxa" w:w="6768"/>
+            <w:tcW w:type="dxa" w:w="5040"/>
             <w:shd w:fill="F8FAFC"/>
             <w:tcMar>
               <w:top w:w="80" w:type="dxa"/>
@@ -286,7 +286,7 @@
       <w:tr>
         <w:tc>
           <w:tcPr>
-            <w:tcW w:type="dxa" w:w="3312"/>
+            <w:tcW w:type="dxa" w:w="5040"/>
             <w:shd w:fill="FFFFFF"/>
             <w:tcMar>
               <w:top w:w="80" w:type="dxa"/>
@@ -303,13 +303,13 @@
               <w:rPr>
                 <w:sz w:val="18"/>
               </w:rPr>
-              <w:t>Ключевая цель спринта:</w:t>
+              <w:t>**Ключевая цель спринта:**</w:t>
             </w:r>
           </w:p>
         </w:tc>
         <w:tc>
           <w:tcPr>
-            <w:tcW w:type="dxa" w:w="6768"/>
+            <w:tcW w:type="dxa" w:w="5040"/>
             <w:shd w:fill="FFFFFF"/>
             <w:tcMar>
               <w:top w:w="80" w:type="dxa"/>
@@ -368,14 +368,14 @@
                 <w:color w:val="003366"/>
                 <w:sz w:val="20"/>
               </w:rPr>
-              <w:t xml:space="preserve">ПРИНЦИП ЭФФЕКТИВНОСТИ И ДОВЕРИЯ: </w:t>
+              <w:t xml:space="preserve">ПРИНЦИП: </w:t>
             </w:r>
             <w:r>
               <w:rPr>
                 <w:i/>
                 <w:sz w:val="19"/>
               </w:rPr>
-              <w:t>Уважаемая госпожа Ли Юйнань! Поздравляем вас со вступлением в команду снабжения компании «Лун-Ван». Главный ориентир в работе снабженца — скорость, глубина технической проверки и персональная ответственность за результат. Мы не учим вас жить и вести диалог с заводами — с вашим пониманием китайского бизнеса вам на месте виднее. От вас требуются: быстрая реакция на заявки, самостоятельность в технических деталях, соблюдение дисциплины и работа на общий результат.</w:t>
+              <w:t>📌 **ПРИНЦИП ЭФФЕКТИВНОСТИ И ДОВЕРИЯ:** Уважаемая госпожа Ли Юйнань! Поздравляем вас со вступлением в команду снабжения компании «Лун-Ван». Главный ориентир в работе снабженца — скорость, глубина технической проверки и персональная ответственность за результат. Мы не учим вас жить и вести диалог с заводами — с вашим пониманием китайского бизнеса вам на месте виднее. От вас требуются: быстрая реакция на заявки, самостоятельность в технических деталях, соблюдение дисциплины и работа на общий результат.</w:t>
             </w:r>
           </w:p>
         </w:tc>
@@ -418,16 +418,9 @@
       </w:pPr>
       <w:r>
         <w:rPr>
-          <w:b/>
           <w:sz w:val="20"/>
         </w:rPr>
-        <w:t xml:space="preserve">Равноправный тандем: </w:t>
-      </w:r>
-      <w:r>
-        <w:rPr>
-          <w:sz w:val="20"/>
-        </w:rPr>
-        <w:t>Вы выходите в полноценный равноправный тандем со специалистом по закупкам госпожой Ван (Miss Wang). Весь входящий поток задач распределяется между вами поровну (50% на 50%).</w:t>
+        <w:t>**Равноправный тандем:** Вы выходите в полноценный равноправный тандем со специалистом по закупкам госпожой Ван (Miss Wang). Весь входящий поток задач распределяется между вами поровну (50% на 50%).</w:t>
       </w:r>
     </w:p>
     <w:p>
@@ -437,16 +430,9 @@
       </w:pPr>
       <w:r>
         <w:rPr>
-          <w:b/>
           <w:sz w:val="20"/>
         </w:rPr>
-        <w:t xml:space="preserve">Взаимовыручка: </w:t>
-      </w:r>
-      <w:r>
-        <w:rPr>
-          <w:sz w:val="20"/>
-        </w:rPr>
-        <w:t>Снабженец Ван и вы — два крыла одного самолета. Вы не конкурируете, а подставляете друг другу плечо: при высокой загрузке подхватываете задачи напарницы и работаете синхронно.</w:t>
+        <w:t>**Взаимовыручка:** Снабженец Ван и вы — два крыла одного самолета. Вы не конкурируете, а подставляете друг другу плечо: при высокой загрузке подхватываете задачи напарницы и работаете синхронно.</w:t>
       </w:r>
     </w:p>
     <w:p>
@@ -456,16 +442,9 @@
       </w:pPr>
       <w:r>
         <w:rPr>
-          <w:b/>
           <w:sz w:val="20"/>
         </w:rPr>
-        <w:t xml:space="preserve">Единая система: </w:t>
-      </w:r>
-      <w:r>
-        <w:rPr>
-          <w:sz w:val="20"/>
-        </w:rPr>
-        <w:t>Вся операционная работа, получение ТЗ и отчетность ведутся в Битрикс24 в соответствии со специальной пошаговой инструкцией.</w:t>
+        <w:t>**Единая система:** Вся операционная работа, получение ТЗ и отчетность ведутся в Битрикс24 в соответствии со специальной пошаговой инструкцией.</w:t>
       </w:r>
     </w:p>
     <w:p>
@@ -507,7 +486,7 @@
       <w:tr>
         <w:tc>
           <w:tcPr>
-            <w:tcW w:type="dxa" w:w="2592"/>
+            <w:tcW w:type="dxa" w:w="3360"/>
             <w:shd w:fill="1E3A8A"/>
             <w:tcMar>
               <w:top w:w="100" w:type="dxa"/>
@@ -533,7 +512,7 @@
         </w:tc>
         <w:tc>
           <w:tcPr>
-            <w:tcW w:type="dxa" w:w="4896"/>
+            <w:tcW w:type="dxa" w:w="3360"/>
             <w:shd w:fill="1E3A8A"/>
             <w:tcMar>
               <w:top w:w="100" w:type="dxa"/>
@@ -559,7 +538,7 @@
         </w:tc>
         <w:tc>
           <w:tcPr>
-            <w:tcW w:type="dxa" w:w="2592"/>
+            <w:tcW w:type="dxa" w:w="3360"/>
             <w:shd w:fill="1E3A8A"/>
             <w:tcMar>
               <w:top w:w="100" w:type="dxa"/>
@@ -587,7 +566,7 @@
       <w:tr>
         <w:tc>
           <w:tcPr>
-            <w:tcW w:type="dxa" w:w="2592"/>
+            <w:tcW w:type="dxa" w:w="3360"/>
             <w:shd w:fill="FFFFFF"/>
             <w:tcMar>
               <w:top w:w="80" w:type="dxa"/>
@@ -604,13 +583,13 @@
               <w:rPr>
                 <w:sz w:val="18"/>
               </w:rPr>
-              <w:t>Александра (Тендерный отдел / Внутренний Клиент)</w:t>
+              <w:t>**Александра (Тендерный отдел / Внутренний Клиент)**</w:t>
             </w:r>
           </w:p>
         </w:tc>
         <w:tc>
           <w:tcPr>
-            <w:tcW w:type="dxa" w:w="4896"/>
+            <w:tcW w:type="dxa" w:w="3360"/>
             <w:shd w:fill="FFFFFF"/>
             <w:tcMar>
               <w:top w:w="80" w:type="dxa"/>
@@ -633,7 +612,7 @@
         </w:tc>
         <w:tc>
           <w:tcPr>
-            <w:tcW w:type="dxa" w:w="2592"/>
+            <w:tcW w:type="dxa" w:w="3360"/>
             <w:shd w:fill="FFFFFF"/>
             <w:tcMar>
               <w:top w:w="80" w:type="dxa"/>
@@ -658,7 +637,7 @@
       <w:tr>
         <w:tc>
           <w:tcPr>
-            <w:tcW w:type="dxa" w:w="2592"/>
+            <w:tcW w:type="dxa" w:w="3360"/>
             <w:shd w:fill="F8FAFC"/>
             <w:tcMar>
               <w:top w:w="80" w:type="dxa"/>
@@ -675,13 +654,13 @@
               <w:rPr>
                 <w:sz w:val="18"/>
               </w:rPr>
-              <w:t>Артём (Я / Руководитель компании)</w:t>
+              <w:t>**Артём (Я / Руководитель компании)**</w:t>
             </w:r>
           </w:p>
         </w:tc>
         <w:tc>
           <w:tcPr>
-            <w:tcW w:type="dxa" w:w="4896"/>
+            <w:tcW w:type="dxa" w:w="3360"/>
             <w:shd w:fill="F8FAFC"/>
             <w:tcMar>
               <w:top w:w="80" w:type="dxa"/>
@@ -704,7 +683,7 @@
         </w:tc>
         <w:tc>
           <w:tcPr>
-            <w:tcW w:type="dxa" w:w="2592"/>
+            <w:tcW w:type="dxa" w:w="3360"/>
             <w:shd w:fill="F8FAFC"/>
             <w:tcMar>
               <w:top w:w="80" w:type="dxa"/>
@@ -729,7 +708,7 @@
       <w:tr>
         <w:tc>
           <w:tcPr>
-            <w:tcW w:type="dxa" w:w="2592"/>
+            <w:tcW w:type="dxa" w:w="3360"/>
             <w:shd w:fill="FFFFFF"/>
             <w:tcMar>
               <w:top w:w="80" w:type="dxa"/>
@@ -746,13 +725,13 @@
               <w:rPr>
                 <w:sz w:val="18"/>
               </w:rPr>
-              <w:t>Анжелика (Логистика РФ / B2B-продажи)</w:t>
+              <w:t>**Анжелика (Логистика РФ / B2B-продажи)**</w:t>
             </w:r>
           </w:p>
         </w:tc>
         <w:tc>
           <w:tcPr>
-            <w:tcW w:type="dxa" w:w="4896"/>
+            <w:tcW w:type="dxa" w:w="3360"/>
             <w:shd w:fill="FFFFFF"/>
             <w:tcMar>
               <w:top w:w="80" w:type="dxa"/>
@@ -775,7 +754,7 @@
         </w:tc>
         <w:tc>
           <w:tcPr>
-            <w:tcW w:type="dxa" w:w="2592"/>
+            <w:tcW w:type="dxa" w:w="3360"/>
             <w:shd w:fill="FFFFFF"/>
             <w:tcMar>
               <w:top w:w="80" w:type="dxa"/>
@@ -800,7 +779,7 @@
       <w:tr>
         <w:tc>
           <w:tcPr>
-            <w:tcW w:type="dxa" w:w="2592"/>
+            <w:tcW w:type="dxa" w:w="3360"/>
             <w:shd w:fill="F8FAFC"/>
             <w:tcMar>
               <w:top w:w="80" w:type="dxa"/>
@@ -817,13 +796,13 @@
               <w:rPr>
                 <w:sz w:val="18"/>
               </w:rPr>
-              <w:t>Азат (Снабжение / Старший куратор)</w:t>
+              <w:t>**Азат (Снабжение / Старший куратор)**</w:t>
             </w:r>
           </w:p>
         </w:tc>
         <w:tc>
           <w:tcPr>
-            <w:tcW w:type="dxa" w:w="4896"/>
+            <w:tcW w:type="dxa" w:w="3360"/>
             <w:shd w:fill="F8FAFC"/>
             <w:tcMar>
               <w:top w:w="80" w:type="dxa"/>
@@ -846,7 +825,7 @@
         </w:tc>
         <w:tc>
           <w:tcPr>
-            <w:tcW w:type="dxa" w:w="2592"/>
+            <w:tcW w:type="dxa" w:w="3360"/>
             <w:shd w:fill="F8FAFC"/>
             <w:tcMar>
               <w:top w:w="80" w:type="dxa"/>
@@ -871,7 +850,7 @@
       <w:tr>
         <w:tc>
           <w:tcPr>
-            <w:tcW w:type="dxa" w:w="2592"/>
+            <w:tcW w:type="dxa" w:w="3360"/>
             <w:shd w:fill="FFFFFF"/>
             <w:tcMar>
               <w:top w:w="80" w:type="dxa"/>
@@ -888,13 +867,13 @@
               <w:rPr>
                 <w:sz w:val="18"/>
               </w:rPr>
-              <w:t>Ван (Miss Wang / user/30)</w:t>
+              <w:t>**Ван (Miss Wang / user/30)**</w:t>
             </w:r>
           </w:p>
         </w:tc>
         <w:tc>
           <w:tcPr>
-            <w:tcW w:type="dxa" w:w="4896"/>
+            <w:tcW w:type="dxa" w:w="3360"/>
             <w:shd w:fill="FFFFFF"/>
             <w:tcMar>
               <w:top w:w="80" w:type="dxa"/>
@@ -917,7 +896,7 @@
         </w:tc>
         <w:tc>
           <w:tcPr>
-            <w:tcW w:type="dxa" w:w="2592"/>
+            <w:tcW w:type="dxa" w:w="3360"/>
             <w:shd w:fill="FFFFFF"/>
             <w:tcMar>
               <w:top w:w="80" w:type="dxa"/>
@@ -942,7 +921,7 @@
       <w:tr>
         <w:tc>
           <w:tcPr>
-            <w:tcW w:type="dxa" w:w="2592"/>
+            <w:tcW w:type="dxa" w:w="3360"/>
             <w:shd w:fill="F8FAFC"/>
             <w:tcMar>
               <w:top w:w="80" w:type="dxa"/>
@@ -959,13 +938,13 @@
               <w:rPr>
                 <w:sz w:val="18"/>
               </w:rPr>
-              <w:t>Цянь Ин (Шеф-логист в КНР)</w:t>
+              <w:t>**Цянь Ин (Шеф-логист в КНР)**</w:t>
             </w:r>
           </w:p>
         </w:tc>
         <w:tc>
           <w:tcPr>
-            <w:tcW w:type="dxa" w:w="4896"/>
+            <w:tcW w:type="dxa" w:w="3360"/>
             <w:shd w:fill="F8FAFC"/>
             <w:tcMar>
               <w:top w:w="80" w:type="dxa"/>
@@ -988,7 +967,7 @@
         </w:tc>
         <w:tc>
           <w:tcPr>
-            <w:tcW w:type="dxa" w:w="2592"/>
+            <w:tcW w:type="dxa" w:w="3360"/>
             <w:shd w:fill="F8FAFC"/>
             <w:tcMar>
               <w:top w:w="80" w:type="dxa"/>
@@ -1013,7 +992,7 @@
       <w:tr>
         <w:tc>
           <w:tcPr>
-            <w:tcW w:type="dxa" w:w="2592"/>
+            <w:tcW w:type="dxa" w:w="3360"/>
             <w:shd w:fill="FFFFFF"/>
             <w:tcMar>
               <w:top w:w="80" w:type="dxa"/>
@@ -1030,13 +1009,13 @@
               <w:rPr>
                 <w:sz w:val="18"/>
               </w:rPr>
-              <w:t>Лиень (user/44, логистическая поддержка / ассистент)</w:t>
+              <w:t>**Лиень (user/44, логистическая поддержка / ассистент)**</w:t>
             </w:r>
           </w:p>
         </w:tc>
         <w:tc>
           <w:tcPr>
-            <w:tcW w:type="dxa" w:w="4896"/>
+            <w:tcW w:type="dxa" w:w="3360"/>
             <w:shd w:fill="FFFFFF"/>
             <w:tcMar>
               <w:top w:w="80" w:type="dxa"/>
@@ -1059,7 +1038,7 @@
         </w:tc>
         <w:tc>
           <w:tcPr>
-            <w:tcW w:type="dxa" w:w="2592"/>
+            <w:tcW w:type="dxa" w:w="3360"/>
             <w:shd w:fill="FFFFFF"/>
             <w:tcMar>
               <w:top w:w="80" w:type="dxa"/>
@@ -1084,7 +1063,7 @@
       <w:tr>
         <w:tc>
           <w:tcPr>
-            <w:tcW w:type="dxa" w:w="2592"/>
+            <w:tcW w:type="dxa" w:w="3360"/>
             <w:shd w:fill="F8FAFC"/>
             <w:tcMar>
               <w:top w:w="80" w:type="dxa"/>
@@ -1101,13 +1080,13 @@
               <w:rPr>
                 <w:sz w:val="18"/>
               </w:rPr>
-              <w:t>Ирина (Главный бухгалтер)</w:t>
+              <w:t>**Ирина (Главный бухгалтер)**</w:t>
             </w:r>
           </w:p>
         </w:tc>
         <w:tc>
           <w:tcPr>
-            <w:tcW w:type="dxa" w:w="4896"/>
+            <w:tcW w:type="dxa" w:w="3360"/>
             <w:shd w:fill="F8FAFC"/>
             <w:tcMar>
               <w:top w:w="80" w:type="dxa"/>
@@ -1130,7 +1109,7 @@
         </w:tc>
         <w:tc>
           <w:tcPr>
-            <w:tcW w:type="dxa" w:w="2592"/>
+            <w:tcW w:type="dxa" w:w="3360"/>
             <w:shd w:fill="F8FAFC"/>
             <w:tcMar>
               <w:top w:w="80" w:type="dxa"/>
@@ -1190,16 +1169,9 @@
       </w:pPr>
       <w:r>
         <w:rPr>
-          <w:b/>
           <w:sz w:val="20"/>
         </w:rPr>
-        <w:t xml:space="preserve">Принцип взаимного доверия: </w:t>
-      </w:r>
-      <w:r>
-        <w:rPr>
-          <w:sz w:val="20"/>
-        </w:rPr>
-        <w:t>Наш бизнес строится на взаимном доверии, порядочности и незыблемости данных обещаний. Мы работаем только с производителями, которые держат слово.</w:t>
+        <w:t>**Принцип взаимного доверия:** Наш бизнес строится на взаимном доверии, порядочности и незыблемости данных обещаний. Мы работаем только с производителями, которые держат слово.</w:t>
       </w:r>
     </w:p>
     <w:p>
@@ -1209,16 +1181,9 @@
       </w:pPr>
       <w:r>
         <w:rPr>
-          <w:b/>
           <w:sz w:val="20"/>
         </w:rPr>
-        <w:t xml:space="preserve">Бескомпромиссный разрыв: </w:t>
-      </w:r>
-      <w:r>
-        <w:rPr>
-          <w:sz w:val="20"/>
-        </w:rPr>
-        <w:t>Если фабрика или поставщик повел себя нечестно — например, пообещал скидку или срок готовности, а затем отказался от договоренности или предоставил ее лишь формально, выказал неуважение, пренебрег важной просьбой или нарушил слово — компания принципиально прекращает любое сотрудничество с таким заводом навсегда. Какой бы выгодной ни казалась цена, мы никогда не работаем с теми, кто не держит слово.</w:t>
+        <w:t>**Бескомпромиссный разрыв:** Если фабрика или поставщик повел себя нечестно — например, пообещал скидку или срок готовности, а затем отказался от договоренности или предоставил ее лишь формально, выказал неуважение, пренебрег важной просьбой или нарушил слово — компания принципиально прекращает любое сотрудничество с таким заводом навсегда. Какой бы выгодной ни казалась цена, мы никогда не работаем с теми, кто не держит слово.</w:t>
       </w:r>
     </w:p>
     <w:p>
@@ -1242,16 +1207,9 @@
       </w:pPr>
       <w:r>
         <w:rPr>
-          <w:b/>
           <w:sz w:val="20"/>
         </w:rPr>
-        <w:t xml:space="preserve">1. Ответственность перед клиентом: </w:t>
-      </w:r>
-      <w:r>
-        <w:rPr>
-          <w:sz w:val="20"/>
-        </w:rPr>
-        <w:t>Подвести клиента по срокам или качеству — недопустимо. Привезти клиенту не то, что он заказывал — грубейшая ошибка. Мы отвечаем за каждое данное обязательство.</w:t>
+        <w:t>**Ответственность перед клиентом:** Подвести клиента по срокам или качеству — недопустимо. Привезти клиенту не то, что он заказывал — грубейшая ошибка. Мы отвечаем за каждое данное обязательство.</w:t>
       </w:r>
     </w:p>
     <w:p>
@@ -1261,16 +1219,9 @@
       </w:pPr>
       <w:r>
         <w:rPr>
-          <w:b/>
           <w:sz w:val="20"/>
         </w:rPr>
-        <w:t xml:space="preserve">2. Запрет лишних расспросов и перевод ГОСТов: </w:t>
-      </w:r>
-      <w:r>
-        <w:rPr>
-          <w:sz w:val="20"/>
-        </w:rPr>
-        <w:t>Избыток ненужных, пустых вопросов клиенту повышает риск потери сделки и снижает доверие к компании. Менеджеры в России — продавцы, а не переводчики. Если в запросе указан русский ГОСТ или чертеж, самостоятельно переведите его через DeepSeek/ChatGPT, выделите размеры, марку стали, вольтаж (380В/50Гц) и задайте фабрике четкие вопросы.</w:t>
+        <w:t>**Запрет лишних расспросов и перевод ГОСТов:** Избыток ненужных, пустых вопросов клиенту повышает риск потери сделки и снижает доверие к компании. Менеджеры в России — продавцы, а не переводчики. Если в запросе указан русский ГОСТ или чертеж, самостоятельно переведите его через DeepSeek/ChatGPT, выделите размеры, марку стали, вольтаж (380В/50Гц) и задайте фабрике четкие вопросы.</w:t>
       </w:r>
     </w:p>
     <w:p>
@@ -1280,16 +1231,9 @@
       </w:pPr>
       <w:r>
         <w:rPr>
-          <w:b/>
           <w:sz w:val="20"/>
         </w:rPr>
-        <w:t xml:space="preserve">3. Скорость — жизнь сделки: </w:t>
-      </w:r>
-      <w:r>
-        <w:rPr>
-          <w:sz w:val="20"/>
-        </w:rPr>
-        <w:t>Готовить расчет 5 дней даже по 5 тендерам — непозволительная роскошь! Во многих случаях 1–2 дней вполне достаточно. Не затягивайте расчеты: получили задачу — как можно быстрее верните КП, желательно сразу с альтернативным производителем.</w:t>
+        <w:t>**Скорость — жизнь сделки:** Готовить расчет 5 дней даже по 5 тендерам — непозволительная роскошь! Во многих случаях 1–2 дней вполне достаточно. Не затягивайте расчеты: получили задачу — как можно быстрее верните КП, желательно сразу с альтернативным производителем.</w:t>
       </w:r>
     </w:p>
     <w:p>
@@ -1299,16 +1243,9 @@
       </w:pPr>
       <w:r>
         <w:rPr>
-          <w:b/>
           <w:sz w:val="20"/>
         </w:rPr>
-        <w:t xml:space="preserve">4. Категорический запрет откладывания: </w:t>
-      </w:r>
-      <w:r>
-        <w:rPr>
-          <w:sz w:val="20"/>
-        </w:rPr>
-        <w:t>Если крайний срок через 3 дня — НЕЛЬЗЯ откладывать задачу до последнего момента! В 80% случаев это приводит к провалу: перед дедлайном всегда всплывают скрытые нестыковки. В коммерческих заказах клиент за 2–3 дня промедления просто покупает у конкурента.</w:t>
+        <w:t>**Категорический запрет откладывания:** Если крайний срок через 3 дня — НЕЛЬЗЯ откладывать задачу до последнего момента! В 80% случаев это приводит к провалу: перед дедлайном всегда всплывают скрытые нестыковки. В коммерческих заказах клиент за 2–3 дня промедления просто покупает у конкурента.</w:t>
       </w:r>
     </w:p>
     <w:p>
@@ -1318,16 +1255,9 @@
       </w:pPr>
       <w:r>
         <w:rPr>
-          <w:b/>
           <w:sz w:val="20"/>
         </w:rPr>
-        <w:t xml:space="preserve">5. Гибкость в переговорах и торг: </w:t>
-      </w:r>
-      <w:r>
-        <w:rPr>
-          <w:sz w:val="20"/>
-        </w:rPr>
-        <w:t>Торг с заводом необходим, но пережимать поставщика нельзя. Зафиксируйте факт, что торг возможен, узнайте минимальную планку цены при нашем объеме и укажите это в КП. Конкретную тактику переговоров выбирайте сами.</w:t>
+        <w:t>**Гибкость в переговорах и торг:** Торг с заводом необходим, но пережимать поставщика нельзя. Зафиксируйте факт, что торг возможен, узнайте минимальную планку цены при нашем объеме и укажите это в КП. Конкретную тактику переговоров выбирайте сами.</w:t>
       </w:r>
     </w:p>
     <w:p>
@@ -1337,16 +1267,9 @@
       </w:pPr>
       <w:r>
         <w:rPr>
-          <w:b/>
           <w:sz w:val="20"/>
         </w:rPr>
-        <w:t xml:space="preserve">6. Габариты и сроки: </w:t>
-      </w:r>
-      <w:r>
-        <w:rPr>
-          <w:sz w:val="20"/>
-        </w:rPr>
-        <w:t>На этапе первичного КП допустима погрешность 5–15%. Главное — сразу зафиксировать, есть ли негабарит (длина, вес, высота), и точный срок производства от завода.</w:t>
+        <w:t>**Габариты и сроки:** На этапе первичного КП допустима погрешность 5–15%. Главное — сразу зафиксировать, есть ли негабарит (длина, вес, высота), и точный срок производства от завода.</w:t>
       </w:r>
     </w:p>
     <w:p>
@@ -1356,16 +1279,9 @@
       </w:pPr>
       <w:r>
         <w:rPr>
-          <w:b/>
           <w:sz w:val="20"/>
         </w:rPr>
-        <w:t xml:space="preserve">7. Корень, а не листья: </w:t>
-      </w:r>
-      <w:r>
-        <w:rPr>
-          <w:sz w:val="20"/>
-        </w:rPr>
-        <w:t>Ищите станок, а не перекупщика с 1688. Запрашивайте у завода видео цеха, фото работающих станков и заводской шильдик с техническими параметрами (вольтаж 380В/50Гц, мощность, обороты).</w:t>
+        <w:t>**Корень, а не листья:** Ищите станок, а не перекупщика с 1688. Запрашивайте у завода видео цеха, фото работающих станков и заводской шильдик с техническими параметрами (вольтаж 380В/50Гц, мощность, обороты).</w:t>
       </w:r>
     </w:p>
     <w:p>
@@ -1375,16 +1291,9 @@
       </w:pPr>
       <w:r>
         <w:rPr>
-          <w:b/>
           <w:sz w:val="20"/>
         </w:rPr>
-        <w:t xml:space="preserve">8. Чистые счета с 13% НДС: </w:t>
-      </w:r>
-      <w:r>
-        <w:rPr>
-          <w:sz w:val="20"/>
-        </w:rPr>
-        <w:t>Четко разделяйте белый экспорт с 13% НДС (专票) и карго без документов. Ошибка в форме счета лишает компанию возврата налога.</w:t>
+        <w:t>**Чистые счета с 13% НДС:** Четко разделяйте белый экспорт с 13% НДС (专票) и карго без документов. Ошибка в форме счета лишает компанию возврата налога.</w:t>
       </w:r>
     </w:p>
     <w:p>
@@ -1426,7 +1335,7 @@
       <w:tr>
         <w:tc>
           <w:tcPr>
-            <w:tcW w:type="dxa" w:w="2160"/>
+            <w:tcW w:type="dxa" w:w="3360"/>
             <w:shd w:fill="1E3A8A"/>
             <w:tcMar>
               <w:top w:w="100" w:type="dxa"/>
@@ -1452,7 +1361,7 @@
         </w:tc>
         <w:tc>
           <w:tcPr>
-            <w:tcW w:type="dxa" w:w="5760"/>
+            <w:tcW w:type="dxa" w:w="3360"/>
             <w:shd w:fill="1E3A8A"/>
             <w:tcMar>
               <w:top w:w="100" w:type="dxa"/>
@@ -1478,7 +1387,7 @@
         </w:tc>
         <w:tc>
           <w:tcPr>
-            <w:tcW w:type="dxa" w:w="2160"/>
+            <w:tcW w:type="dxa" w:w="3360"/>
             <w:shd w:fill="1E3A8A"/>
             <w:tcMar>
               <w:top w:w="100" w:type="dxa"/>
@@ -1506,7 +1415,7 @@
       <w:tr>
         <w:tc>
           <w:tcPr>
-            <w:tcW w:type="dxa" w:w="2160"/>
+            <w:tcW w:type="dxa" w:w="3360"/>
             <w:shd w:fill="FFFFFF"/>
             <w:tcMar>
               <w:top w:w="80" w:type="dxa"/>
@@ -1523,15 +1432,15 @@
               <w:rPr>
                 <w:sz w:val="18"/>
               </w:rPr>
-              <w:t>Неделя 1</w:t>
+              <w:t>**Неделя 1</w:t>
               <w:br/>
-              <w:t>(Дни 1–5)</w:t>
+              <w:t>(Дни 1–5)**</w:t>
             </w:r>
           </w:p>
         </w:tc>
         <w:tc>
           <w:tcPr>
-            <w:tcW w:type="dxa" w:w="5760"/>
+            <w:tcW w:type="dxa" w:w="3360"/>
             <w:shd w:fill="FFFFFF"/>
             <w:tcMar>
               <w:top w:w="80" w:type="dxa"/>
@@ -1562,7 +1471,7 @@
         </w:tc>
         <w:tc>
           <w:tcPr>
-            <w:tcW w:type="dxa" w:w="2160"/>
+            <w:tcW w:type="dxa" w:w="3360"/>
             <w:shd w:fill="FFFFFF"/>
             <w:tcMar>
               <w:top w:w="80" w:type="dxa"/>
@@ -1587,7 +1496,7 @@
       <w:tr>
         <w:tc>
           <w:tcPr>
-            <w:tcW w:type="dxa" w:w="2160"/>
+            <w:tcW w:type="dxa" w:w="3360"/>
             <w:shd w:fill="F8FAFC"/>
             <w:tcMar>
               <w:top w:w="80" w:type="dxa"/>
@@ -1604,15 +1513,15 @@
               <w:rPr>
                 <w:sz w:val="18"/>
               </w:rPr>
-              <w:t>Неделя 2</w:t>
+              <w:t>**Неделя 2</w:t>
               <w:br/>
-              <w:t>(Дни 6–10)</w:t>
+              <w:t>(Дни 6–10)**</w:t>
             </w:r>
           </w:p>
         </w:tc>
         <w:tc>
           <w:tcPr>
-            <w:tcW w:type="dxa" w:w="5760"/>
+            <w:tcW w:type="dxa" w:w="3360"/>
             <w:shd w:fill="F8FAFC"/>
             <w:tcMar>
               <w:top w:w="80" w:type="dxa"/>
@@ -1643,7 +1552,7 @@
         </w:tc>
         <w:tc>
           <w:tcPr>
-            <w:tcW w:type="dxa" w:w="2160"/>
+            <w:tcW w:type="dxa" w:w="3360"/>
             <w:shd w:fill="F8FAFC"/>
             <w:tcMar>
               <w:top w:w="80" w:type="dxa"/>
@@ -1702,14 +1611,14 @@
                 <w:color w:val="003366"/>
                 <w:sz w:val="20"/>
               </w:rPr>
-              <w:t xml:space="preserve">ПРИНЦИП ОТКРЫТОСТИ: </w:t>
+              <w:t xml:space="preserve">ПРИНЦИП: </w:t>
             </w:r>
             <w:r>
               <w:rPr>
                 <w:i/>
                 <w:sz w:val="19"/>
               </w:rPr>
-              <w:t>Если задача не ясна — спросите сразу в комментариях Битрикс24. Если задача заведомо невыполнима — скажите об этом прямо и немедленно. Мы ждем от вас инициативы, энергии и профессионализма!</w:t>
+              <w:t>📌 **ПРИНЦИП ОТКРЫТОСТИ:** Если задача не ясна — спросите сразу в комментариях Битрикс24. Если задача заведомо невыполнима — скажите об этом прямо и немедленно. Мы ждем от вас инициативы, энергии и профессионализма!</w:t>
             </w:r>
           </w:p>
         </w:tc>

</xml_diff>